<commit_message>
CV: add nine invited talks (re-export from master Google Doc)
Co-Authored-By: Claude Opus 5.5 <noreply@anthropic.com>
</commit_message>
<xml_diff>
--- a/cv/1-Westover_CV.docx
+++ b/cv/1-Westover_CV.docx
@@ -2897,9 +2897,9 @@
         </w:rPr>
         <w:t xml:space="preserve">, “Data-Driven Modeling of Sleep States from EEG”</w:t>
       </w:r>
-      <w:bookmarkStart w:colFirst="0" w:colLast="0" w:name="3sso3gh0aao4" w:id="0"/>
+      <w:bookmarkStart w:colFirst="0" w:colLast="0" w:name="biy3r5ssok4n" w:id="0"/>
       <w:bookmarkEnd w:id="0"/>
-      <w:bookmarkStart w:colFirst="0" w:colLast="0" w:name="rdcnc4xpwg8r" w:id="1"/>
+      <w:bookmarkStart w:colFirst="0" w:colLast="0" w:name="p1ytln4bqp2x" w:id="1"/>
       <w:bookmarkEnd w:id="1"/>
       <w:r>
         <w:rPr>
@@ -6957,7 +6957,7 @@
           <w:color w:val="000000"/>
         </w:rPr>
       </w:pPr>
-      <w:bookmarkStart w:colFirst="0" w:colLast="0" w:name="_5ky3t4vuoaw2" w:id="2"/>
+      <w:bookmarkStart w:colFirst="0" w:colLast="0" w:name="_ed7iao5i3412" w:id="2"/>
       <w:bookmarkEnd w:id="2"/>
       <w:r>
         <w:rPr>
@@ -9866,7 +9866,7 @@
           <w:vertAlign w:val="baseline"/>
         </w:rPr>
       </w:pPr>
-      <w:bookmarkStart w:colFirst="0" w:colLast="0" w:name="_4z88nbw2cclr" w:id="3"/>
+      <w:bookmarkStart w:colFirst="0" w:colLast="0" w:name="_xqaknfw4iozr" w:id="3"/>
       <w:bookmarkEnd w:id="3"/>
       <w:r>
         <w:rPr>
@@ -12421,7 +12421,7 @@
           <w:vertAlign w:val="baseline"/>
         </w:rPr>
       </w:pPr>
-      <w:bookmarkStart w:colFirst="0" w:colLast="0" w:name="_88gn9yh36uuo" w:id="4"/>
+      <w:bookmarkStart w:colFirst="0" w:colLast="0" w:name="_gi54j25v5xkd" w:id="4"/>
       <w:bookmarkEnd w:id="4"/>
       <w:r>
         <w:rPr>
@@ -12831,7 +12831,7 @@
           <w:color w:val="000000"/>
         </w:rPr>
       </w:pPr>
-      <w:bookmarkStart w:colFirst="0" w:colLast="0" w:name="_jgpu778y63wo" w:id="5"/>
+      <w:bookmarkStart w:colFirst="0" w:colLast="0" w:name="_faqb48wfnyd8" w:id="5"/>
       <w:bookmarkEnd w:id="5"/>
       <w:r>
         <w:rPr>
@@ -12885,7 +12885,7 @@
           <w:color w:val="000000"/>
         </w:rPr>
       </w:pPr>
-      <w:bookmarkStart w:colFirst="0" w:colLast="0" w:name="_tld410hy6qyk" w:id="6"/>
+      <w:bookmarkStart w:colFirst="0" w:colLast="0" w:name="_cpxdlfnpgld4" w:id="6"/>
       <w:bookmarkEnd w:id="6"/>
       <w:r>
         <w:rPr>
@@ -13529,7 +13529,7 @@
         </w:rPr>
         <w:t xml:space="preserve">. “EEG Classification via Convolutional Neural Network-Based Interictal Epileptiform Event Detection.” </w:t>
       </w:r>
-      <w:bookmarkStart w:colFirst="0" w:colLast="0" w:name="ghbjg935lcbl" w:id="7"/>
+      <w:bookmarkStart w:colFirst="0" w:colLast="0" w:name="x44htwucvhfv" w:id="7"/>
       <w:bookmarkEnd w:id="7"/>
       <w:r>
         <w:rPr>
@@ -14725,7 +14725,7 @@
           <w:color w:val="000000"/>
         </w:rPr>
       </w:pPr>
-      <w:bookmarkStart w:colFirst="0" w:colLast="0" w:name="_y6lm33wb885b" w:id="8"/>
+      <w:bookmarkStart w:colFirst="0" w:colLast="0" w:name="_jrzm22ecjohu" w:id="8"/>
       <w:bookmarkEnd w:id="8"/>
       <w:r>
         <w:rPr>
@@ -14779,7 +14779,7 @@
           <w:color w:val="000000"/>
         </w:rPr>
       </w:pPr>
-      <w:bookmarkStart w:colFirst="0" w:colLast="0" w:name="_wwm030o0dd8r" w:id="9"/>
+      <w:bookmarkStart w:colFirst="0" w:colLast="0" w:name="_dzlkdt7hhwmj" w:id="9"/>
       <w:bookmarkEnd w:id="9"/>
       <w:r>
         <w:rPr>
@@ -14845,7 +14845,7 @@
           <w:color w:val="000000"/>
         </w:rPr>
       </w:pPr>
-      <w:bookmarkStart w:colFirst="0" w:colLast="0" w:name="_xir9wtql7b0b" w:id="10"/>
+      <w:bookmarkStart w:colFirst="0" w:colLast="0" w:name="_a63vlkops1le" w:id="10"/>
       <w:bookmarkEnd w:id="10"/>
       <w:r>
         <w:rPr>
@@ -15172,7 +15172,7 @@
           <w:color w:val="000000"/>
         </w:rPr>
       </w:pPr>
-      <w:bookmarkStart w:colFirst="0" w:colLast="0" w:name="_2ohrgxmvwo8w" w:id="11"/>
+      <w:bookmarkStart w:colFirst="0" w:colLast="0" w:name="_hex00sx5q660" w:id="11"/>
       <w:bookmarkEnd w:id="11"/>
       <w:r>
         <w:rPr>
@@ -16137,7 +16137,7 @@
           <w:vertAlign w:val="baseline"/>
         </w:rPr>
       </w:pPr>
-      <w:bookmarkStart w:colFirst="0" w:colLast="0" w:name="_ly6xex5l34ly" w:id="12"/>
+      <w:bookmarkStart w:colFirst="0" w:colLast="0" w:name="_lx64eklqnhwb" w:id="12"/>
       <w:bookmarkEnd w:id="12"/>
       <w:r>
         <w:rPr>
@@ -16326,7 +16326,7 @@
         <w:ind w:left="480" w:hanging="360"/>
         <w:rPr/>
       </w:pPr>
-      <w:bookmarkStart w:colFirst="0" w:colLast="0" w:name="_4y6oun3mksks" w:id="13"/>
+      <w:bookmarkStart w:colFirst="0" w:colLast="0" w:name="_n1jvye4n9g55" w:id="13"/>
       <w:bookmarkEnd w:id="13"/>
       <w:r>
         <w:rPr>
@@ -16449,7 +16449,7 @@
         <w:ind w:left="480" w:hanging="360"/>
         <w:rPr/>
       </w:pPr>
-      <w:bookmarkStart w:colFirst="0" w:colLast="0" w:name="_j2sumj8lf281" w:id="14"/>
+      <w:bookmarkStart w:colFirst="0" w:colLast="0" w:name="_ujjjj0jh7fw8" w:id="14"/>
       <w:bookmarkEnd w:id="14"/>
       <w:r>
         <w:rPr>
@@ -16859,7 +16859,7 @@
           <w:vertAlign w:val="baseline"/>
         </w:rPr>
       </w:pPr>
-      <w:bookmarkStart w:colFirst="0" w:colLast="0" w:name="_wlkpryres36b" w:id="15"/>
+      <w:bookmarkStart w:colFirst="0" w:colLast="0" w:name="_3qqasjrod93n" w:id="15"/>
       <w:bookmarkEnd w:id="15"/>
       <w:r>
         <w:rPr>
@@ -18023,7 +18023,7 @@
         <w:jc w:val="left"/>
         <w:rPr/>
       </w:pPr>
-      <w:bookmarkStart w:colFirst="0" w:colLast="0" w:name="_a9cdi4hrck19" w:id="16"/>
+      <w:bookmarkStart w:colFirst="0" w:colLast="0" w:name="_khu1wppopfoi" w:id="16"/>
       <w:bookmarkEnd w:id="16"/>
       <w:r>
         <w:rPr>
@@ -18554,7 +18554,7 @@
         <w:jc w:val="left"/>
         <w:rPr/>
       </w:pPr>
-      <w:bookmarkStart w:colFirst="0" w:colLast="0" w:name="_gcfhsis3js8o" w:id="17"/>
+      <w:bookmarkStart w:colFirst="0" w:colLast="0" w:name="_ij5db82rl3ab" w:id="17"/>
       <w:bookmarkEnd w:id="17"/>
       <w:r>
         <w:rPr>
@@ -19023,7 +19023,7 @@
         <w:jc w:val="left"/>
         <w:rPr/>
       </w:pPr>
-      <w:bookmarkStart w:colFirst="0" w:colLast="0" w:name="_aud3kqgipcs1" w:id="18"/>
+      <w:bookmarkStart w:colFirst="0" w:colLast="0" w:name="_or8cdw3xvnbs" w:id="18"/>
       <w:bookmarkEnd w:id="18"/>
       <w:r>
         <w:rPr>
@@ -19711,7 +19711,7 @@
           <w:vertAlign w:val="baseline"/>
         </w:rPr>
       </w:pPr>
-      <w:bookmarkStart w:colFirst="0" w:colLast="0" w:name="_2qwfx046mkod" w:id="19"/>
+      <w:bookmarkStart w:colFirst="0" w:colLast="0" w:name="_v8sxv8qytst2" w:id="19"/>
       <w:bookmarkEnd w:id="19"/>
       <w:r>
         <w:rPr>
@@ -21000,7 +21000,7 @@
           <w:vertAlign w:val="baseline"/>
         </w:rPr>
       </w:pPr>
-      <w:bookmarkStart w:colFirst="0" w:colLast="0" w:name="_dqpxqwmoeeax" w:id="20"/>
+      <w:bookmarkStart w:colFirst="0" w:colLast="0" w:name="_f57w1bhrqv0i" w:id="20"/>
       <w:bookmarkEnd w:id="20"/>
       <w:r>
         <w:rPr>
@@ -21979,7 +21979,7 @@
         <w:jc w:val="left"/>
         <w:rPr/>
       </w:pPr>
-      <w:bookmarkStart w:colFirst="0" w:colLast="0" w:name="_809hij4rkadb" w:id="21"/>
+      <w:bookmarkStart w:colFirst="0" w:colLast="0" w:name="_72p4bgfj7v7s" w:id="21"/>
       <w:bookmarkEnd w:id="21"/>
       <w:r>
         <w:rPr>
@@ -22610,7 +22610,7 @@
         <w:jc w:val="left"/>
         <w:rPr/>
       </w:pPr>
-      <w:bookmarkStart w:colFirst="0" w:colLast="0" w:name="_9cu2bf5un597" w:id="22"/>
+      <w:bookmarkStart w:colFirst="0" w:colLast="0" w:name="_i7q92tmi80qf" w:id="22"/>
       <w:bookmarkEnd w:id="22"/>
       <w:r>
         <w:rPr>
@@ -23712,7 +23712,7 @@
         <w:jc w:val="left"/>
         <w:rPr/>
       </w:pPr>
-      <w:bookmarkStart w:colFirst="0" w:colLast="0" w:name="_1g5o38h044bp" w:id="23"/>
+      <w:bookmarkStart w:colFirst="0" w:colLast="0" w:name="_ymng98ebbxus" w:id="23"/>
       <w:bookmarkEnd w:id="23"/>
       <w:r>
         <w:rPr>
@@ -24815,7 +24815,7 @@
         <w:jc w:val="left"/>
         <w:rPr/>
       </w:pPr>
-      <w:bookmarkStart w:colFirst="0" w:colLast="0" w:name="_rm8o0lex75mw" w:id="24"/>
+      <w:bookmarkStart w:colFirst="0" w:colLast="0" w:name="_lrxhrfvdud89" w:id="24"/>
       <w:bookmarkEnd w:id="24"/>
       <w:r>
         <w:rPr>
@@ -25308,7 +25308,7 @@
         <w:jc w:val="left"/>
         <w:rPr/>
       </w:pPr>
-      <w:bookmarkStart w:colFirst="0" w:colLast="0" w:name="_889dbmhesl79" w:id="25"/>
+      <w:bookmarkStart w:colFirst="0" w:colLast="0" w:name="_oc82b7l02hcw" w:id="25"/>
       <w:bookmarkEnd w:id="25"/>
       <w:r>
         <w:rPr>
@@ -47173,6 +47173,46 @@
     </w:p>
     <w:p>
       <w:pPr>
+        <w:numPr>
+          <w:ilvl w:val="0"/>
+          <w:numId w:val="10"/>
+        </w:numPr>
+        <w:tabs>
+          <w:tab w:val="left" w:leader="none" w:pos="720"/>
+          <w:tab w:val="left" w:leader="none" w:pos="1080"/>
+        </w:tabs>
+        <w:ind w:left="720" w:hanging="360"/>
+        <w:rPr/>
+      </w:pPr>
+      <w:r>
+        <w:rPr>
+          <w:rtl w:val="0"/>
+        </w:rPr>
+        <w:t xml:space="preserve">“Reducing Diagnostic Noise in Neurology: Lessons from Epilepsy.” Neurology Grand Rounds, Stanford University, Palo Alto, CA (2025)</w:t>
+      </w:r>
+    </w:p>
+    <w:p>
+      <w:pPr>
+        <w:numPr>
+          <w:ilvl w:val="0"/>
+          <w:numId w:val="10"/>
+        </w:numPr>
+        <w:tabs>
+          <w:tab w:val="left" w:leader="none" w:pos="720"/>
+          <w:tab w:val="left" w:leader="none" w:pos="1080"/>
+        </w:tabs>
+        <w:ind w:left="720" w:hanging="360"/>
+        <w:rPr/>
+      </w:pPr>
+      <w:r>
+        <w:rPr>
+          <w:rtl w:val="0"/>
+        </w:rPr>
+        <w:t xml:space="preserve">“Designing Randomized Trials for Nonconvulsive Status Epilepticus Using Observational Data.” Neurology Grand Rounds, Montefiore Einstein, Bronx, NY (2026)</w:t>
+      </w:r>
+    </w:p>
+    <w:p>
+      <w:pPr>
         <w:tabs>
           <w:tab w:val="left" w:leader="none" w:pos="720"/>
           <w:tab w:val="left" w:leader="none" w:pos="1080"/>
@@ -48120,6 +48160,67 @@
           <w:rtl w:val="0"/>
         </w:rPr>
         <w:t xml:space="preserve">“Validating the Brain Age Index: Modifying Brain Aging Through Exercise.” McCance Center for Brain Health Faculty Meeting, Boston, MA (2019)</w:t>
+      </w:r>
+    </w:p>
+    <w:p>
+      <w:pPr>
+        <w:keepNext w:val="0"/>
+        <w:keepLines w:val="0"/>
+        <w:pageBreakBefore w:val="0"/>
+        <w:widowControl w:val="1"/>
+        <w:numPr>
+          <w:ilvl w:val="0"/>
+          <w:numId w:val="8"/>
+        </w:numPr>
+        <w:pBdr>
+          <w:top w:space="0" w:sz="0" w:val="nil"/>
+          <w:left w:space="0" w:sz="0" w:val="nil"/>
+          <w:bottom w:space="0" w:sz="0" w:val="nil"/>
+          <w:right w:space="0" w:sz="0" w:val="nil"/>
+          <w:between w:space="0" w:sz="0" w:val="nil"/>
+        </w:pBdr>
+        <w:shd w:fill="auto" w:val="clear"/>
+        <w:tabs>
+          <w:tab w:val="left" w:leader="none" w:pos="360"/>
+          <w:tab w:val="left" w:leader="none" w:pos="1080"/>
+        </w:tabs>
+        <w:spacing w:after="0" w:before="0" w:line="240" w:lineRule="auto"/>
+        <w:ind w:left="720" w:right="0" w:hanging="360"/>
+        <w:jc w:val="left"/>
+        <w:rPr>
+          <w:rFonts w:ascii="Times New Roman" w:cs="Times New Roman" w:eastAsia="Times New Roman" w:hAnsi="Times New Roman"/>
+          <w:b w:val="0"/>
+          <w:bCs w:val="0"/>
+          <w:i w:val="0"/>
+          <w:iCs w:val="0"/>
+          <w:smallCaps w:val="0"/>
+          <w:strike w:val="0"/>
+          <w:color w:val="000000"/>
+          <w:sz w:val="24"/>
+          <w:szCs w:val="24"/>
+          <w:u w:val="none"/>
+          <w:shd w:fill="auto" w:val="clear"/>
+          <w:vertAlign w:val="baseline"/>
+        </w:rPr>
+      </w:pPr>
+      <w:r>
+        <w:rPr>
+          <w:rFonts w:ascii="Times New Roman" w:cs="Times New Roman" w:eastAsia="Times New Roman" w:hAnsi="Times New Roman"/>
+          <w:b w:val="0"/>
+          <w:bCs w:val="0"/>
+          <w:i w:val="0"/>
+          <w:iCs w:val="0"/>
+          <w:smallCaps w:val="0"/>
+          <w:strike w:val="0"/>
+          <w:color w:val="000000"/>
+          <w:sz w:val="24"/>
+          <w:szCs w:val="24"/>
+          <w:u w:val="none"/>
+          <w:shd w:fill="auto" w:val="clear"/>
+          <w:vertAlign w:val="baseline"/>
+          <w:rtl w:val="0"/>
+        </w:rPr>
+        <w:t xml:space="preserve">“Automating Clinical Neurophysiology.” Special Seminar, Department of Brain &amp; Cognitive Sciences, MIT, Cambridge, MA (2020)</w:t>
       </w:r>
     </w:p>
     <w:p>
@@ -48313,7 +48414,7 @@
           <w:vertAlign w:val="baseline"/>
           <w:rtl w:val="0"/>
         </w:rPr>
-        <w:t xml:space="preserve">“Early Detection of Delayed Cerebral Ischemia Using EEG.” Greater Boston Epilepsy Society, Boston, MA (2015)</w:t>
+        <w:t xml:space="preserve">“EEG Monitoring and Closed-Loop Control of Burst Suppression.” American Clinical Neurophysiology Society Annual Meeting, Miami, FL (2013)</w:t>
       </w:r>
     </w:p>
     <w:p>
@@ -48360,7 +48461,7 @@
           <w:vertAlign w:val="baseline"/>
           <w:rtl w:val="0"/>
         </w:rPr>
-        <w:t xml:space="preserve">“Polysomnographic Signatures of Brain Age.” Massachusetts Sleep Society, Westborough, MA (2017)</w:t>
+        <w:t xml:space="preserve">“Early Detection of Delayed Cerebral Ischemia Using EEG.” Greater Boston Epilepsy Society, Boston, MA (2015)</w:t>
       </w:r>
     </w:p>
     <w:p>
@@ -48407,7 +48508,7 @@
           <w:vertAlign w:val="baseline"/>
           <w:rtl w:val="0"/>
         </w:rPr>
-        <w:t xml:space="preserve">“Artificially Intelligent Brain Monitoring.” World Medical Innovation Forum, Boston, MA (2019)</w:t>
+        <w:t xml:space="preserve">“Why Brains Need Computers: How Computer Science and Engineering Can Improve Neurology.” Computational Health Distinguished Lecture Series, Georgia Institute of Technology, Atlanta, GA (2016)</w:t>
       </w:r>
     </w:p>
     <w:p>
@@ -48454,7 +48555,7 @@
           <w:vertAlign w:val="baseline"/>
           <w:rtl w:val="0"/>
         </w:rPr>
-        <w:t xml:space="preserve">“Expert-Level Automatic Detection of Epileptiform Discharges.” American Neurological Association, St. Louis, MO (2019)</w:t>
+        <w:t xml:space="preserve">“Polysomnographic Signatures of Brain Age.” Massachusetts Sleep Society, Westborough, MA (2017)</w:t>
       </w:r>
     </w:p>
     <w:p>
@@ -48501,7 +48602,7 @@
           <w:vertAlign w:val="baseline"/>
           <w:rtl w:val="0"/>
         </w:rPr>
-        <w:t xml:space="preserve">“EEG Monitoring for Early Detection of Cerebral Ischemia.” American Clinical Neurophysiology Society Annual Meeting, New Orleans, LA (2020)</w:t>
+        <w:t xml:space="preserve">“Artificially Intelligent Brain Monitoring.” World Medical Innovation Forum, Boston, MA (2019)</w:t>
       </w:r>
     </w:p>
     <w:p>
@@ -48548,7 +48649,7 @@
           <w:vertAlign w:val="baseline"/>
           <w:rtl w:val="0"/>
         </w:rPr>
-        <w:t xml:space="preserve">“Automating Clinical Neurophysiology.” Duke Comprehensive Epilepsy Center Quarterly Research Symposium, Durham, NC (2020)</w:t>
+        <w:t xml:space="preserve">“Expert-Level Automatic Detection of Epileptiform Discharges.” American Neurological Association, St. Louis, MO (2019)</w:t>
       </w:r>
     </w:p>
     <w:p>
@@ -48595,7 +48696,7 @@
           <w:vertAlign w:val="baseline"/>
           <w:rtl w:val="0"/>
         </w:rPr>
-        <w:t xml:space="preserve">“Big Data and Machine Learning to Advance Status Epilepticus Research.” American Neurological Association, Virtual Meeting (2020)</w:t>
+        <w:t xml:space="preserve">“Quantitative EEG for Ischemia Detection.” American Clinical Neurophysiology Society Annual Meeting, Las Vegas, NV (2019)</w:t>
       </w:r>
     </w:p>
     <w:p>
@@ -48642,7 +48743,7 @@
           <w:vertAlign w:val="baseline"/>
           <w:rtl w:val="0"/>
         </w:rPr>
-        <w:t xml:space="preserve">“Automated Detection of Seizures and Ictal–Interictal Continuum Patterns Using Deep Learning.” American Clinical Neurophysiology Society Annual Meeting, Virtual (2021)</w:t>
+        <w:t xml:space="preserve">“EEG Monitoring for Early Detection of Cerebral Ischemia.” American Clinical Neurophysiology Society Annual Meeting, New Orleans, LA (2020)</w:t>
       </w:r>
     </w:p>
     <w:p>
@@ -48689,7 +48790,7 @@
           <w:vertAlign w:val="baseline"/>
           <w:rtl w:val="0"/>
         </w:rPr>
-        <w:t xml:space="preserve">“Sleep as a Window into Brain Health.” Harvard Sleep Grand Rounds, Virtual (2021)</w:t>
+        <w:t xml:space="preserve">“Automating Clinical Neurophysiology.” Duke Comprehensive Epilepsy Center Quarterly Research Symposium, Durham, NC (2020)</w:t>
       </w:r>
     </w:p>
     <w:p>
@@ -48736,7 +48837,7 @@
           <w:vertAlign w:val="baseline"/>
           <w:rtl w:val="0"/>
         </w:rPr>
-        <w:t xml:space="preserve">“Avoiding Pitfalls in EEG Interpretation.” American Academy of Neurology Annual Meeting, Seattle, WA (2022)</w:t>
+        <w:t xml:space="preserve">“Big Data and Machine Learning to Advance Status Epilepticus Research.” American Neurological Association, Virtual Meeting (2020)</w:t>
       </w:r>
     </w:p>
     <w:p>
@@ -48783,7 +48884,7 @@
           <w:vertAlign w:val="baseline"/>
           <w:rtl w:val="0"/>
         </w:rPr>
-        <w:t xml:space="preserve">“Artificial Intelligence in Sleep Medicine.” American Neurological Association Annual Meeting, Chicago, IL (2022)</w:t>
+        <w:t xml:space="preserve">“Automated Detection of Seizures and Ictal–Interictal Continuum Patterns Using Deep Learning.” American Clinical Neurophysiology Society Annual Meeting, Virtual (2021)</w:t>
       </w:r>
     </w:p>
     <w:p>
@@ -48830,7 +48931,7 @@
           <w:vertAlign w:val="baseline"/>
           <w:rtl w:val="0"/>
         </w:rPr>
-        <w:t xml:space="preserve">“Addressing Problems in Critical Care Neurophysiology Using Machine Learning.” Machine Learning in Medicine Seminar Series, Carnegie Mellon University, Pittsburgh, PA (2022)</w:t>
+        <w:t xml:space="preserve">“Sleep as a Window into Brain Health.” Harvard Sleep Grand Rounds, Virtual (2021)</w:t>
       </w:r>
     </w:p>
     <w:p>
@@ -48877,7 +48978,7 @@
           <w:vertAlign w:val="baseline"/>
           <w:rtl w:val="0"/>
         </w:rPr>
-        <w:t xml:space="preserve">“Epileptiform and Non-Epileptiform Findings in ICU Electroencephalography.” American Academy of Neurology Annual Meeting, Boston, MA (2023)</w:t>
+        <w:t xml:space="preserve">“Avoiding Pitfalls in EEG Interpretation.” American Academy of Neurology Annual Meeting, Seattle, WA (2022)</w:t>
       </w:r>
     </w:p>
     <w:p>
@@ -48924,7 +49025,7 @@
           <w:vertAlign w:val="baseline"/>
           <w:rtl w:val="0"/>
         </w:rPr>
-        <w:t xml:space="preserve">“Neurophysiological Grading of Encephalopathy.” American Academy of Neurology Annual Meeting, Boston, MA (2023)</w:t>
+        <w:t xml:space="preserve">“Artificial Intelligence in Sleep Medicine.” American Neurological Association Annual Meeting, Chicago, IL (2022)</w:t>
       </w:r>
     </w:p>
     <w:p>
@@ -48971,7 +49072,7 @@
           <w:vertAlign w:val="baseline"/>
           <w:rtl w:val="0"/>
         </w:rPr>
-        <w:t xml:space="preserve">“Identifying and Overcoming Barriers for Clinical Use of Artificial Intelligence in Sleep Medicine.” American Academy of Sleep Medicine Annual Meeting, Indianapolis, IN (2023)</w:t>
+        <w:t xml:space="preserve">“Addressing Problems in Critical Care Neurophysiology Using Machine Learning.” Machine Learning in Medicine Seminar Series, Carnegie Mellon University, Pittsburgh, PA (2022)</w:t>
       </w:r>
     </w:p>
     <w:p>
@@ -49018,7 +49119,7 @@
           <w:vertAlign w:val="baseline"/>
           <w:rtl w:val="0"/>
         </w:rPr>
-        <w:t xml:space="preserve">“Optimizing Treatment of Nonconvulsive Status Epilepticus.” American Epilepsy Society Annual Meeting, Orlando, FL (2023)</w:t>
+        <w:t xml:space="preserve">“Epileptiform and Non-Epileptiform Findings in ICU Electroencephalography.” American Academy of Neurology Annual Meeting, Boston, MA (2023)</w:t>
       </w:r>
     </w:p>
     <w:p>
@@ -49065,7 +49166,7 @@
           <w:vertAlign w:val="baseline"/>
           <w:rtl w:val="0"/>
         </w:rPr>
-        <w:t xml:space="preserve">“Collaborating with Industry.” American Clinical Neurophysiology Society Annual Meeting, Orlando, FL (2024)</w:t>
+        <w:t xml:space="preserve">“Neurophysiological Grading of Encephalopathy.” American Academy of Neurology Annual Meeting, Boston, MA (2023)</w:t>
       </w:r>
     </w:p>
     <w:p>
@@ -49112,7 +49213,7 @@
           <w:vertAlign w:val="baseline"/>
           <w:rtl w:val="0"/>
         </w:rPr>
-        <w:t xml:space="preserve">“Quantitative EEG.” American Clinical Neurophysiology Society Annual Meeting, Orlando, FL (2024)</w:t>
+        <w:t xml:space="preserve">“Identifying and Overcoming Barriers for Clinical Use of Artificial Intelligence in Sleep Medicine.” American Academy of Sleep Medicine Annual Meeting, Indianapolis, IN (2023)</w:t>
       </w:r>
     </w:p>
     <w:p>
@@ -49159,7 +49260,7 @@
           <w:vertAlign w:val="baseline"/>
           <w:rtl w:val="0"/>
         </w:rPr>
-        <w:t xml:space="preserve">“The EEG Map of Everything (MOE).” Critical Care EEG Monitoring Research Consortium Meeting, Orlando, FL (2024)</w:t>
+        <w:t xml:space="preserve">“Optimizing Treatment of Nonconvulsive Status Epilepticus.” American Epilepsy Society Annual Meeting, Orlando, FL (2023)</w:t>
       </w:r>
     </w:p>
     <w:p>
@@ -49206,7 +49307,289 @@
           <w:vertAlign w:val="baseline"/>
           <w:rtl w:val="0"/>
         </w:rPr>
+        <w:t xml:space="preserve">“Multimodal Monitoring and Brain Monitoring for Ischemia.” American Clinical Neurophysiology Society Annual Meeting, Austin, TX (2023)</w:t>
+      </w:r>
+    </w:p>
+    <w:p>
+      <w:pPr>
+        <w:keepNext w:val="0"/>
+        <w:keepLines w:val="0"/>
+        <w:pageBreakBefore w:val="0"/>
+        <w:widowControl w:val="1"/>
+        <w:numPr>
+          <w:ilvl w:val="0"/>
+          <w:numId w:val="9"/>
+        </w:numPr>
+        <w:pBdr>
+          <w:top w:space="0" w:sz="0" w:val="nil"/>
+          <w:left w:space="0" w:sz="0" w:val="nil"/>
+          <w:bottom w:space="0" w:sz="0" w:val="nil"/>
+          <w:right w:space="0" w:sz="0" w:val="nil"/>
+          <w:between w:space="0" w:sz="0" w:val="nil"/>
+        </w:pBdr>
+        <w:shd w:fill="auto" w:val="clear"/>
+        <w:tabs>
+          <w:tab w:val="left" w:leader="none" w:pos="720"/>
+          <w:tab w:val="left" w:leader="none" w:pos="1080"/>
+        </w:tabs>
+        <w:spacing w:after="0" w:before="0" w:line="240" w:lineRule="auto"/>
+        <w:ind w:left="720" w:right="0" w:hanging="360"/>
+        <w:jc w:val="left"/>
+        <w:rPr/>
+      </w:pPr>
+      <w:r>
+        <w:rPr>
+          <w:rFonts w:ascii="Times New Roman" w:cs="Times New Roman" w:eastAsia="Times New Roman" w:hAnsi="Times New Roman"/>
+          <w:b w:val="0"/>
+          <w:bCs w:val="0"/>
+          <w:i w:val="0"/>
+          <w:iCs w:val="0"/>
+          <w:smallCaps w:val="0"/>
+          <w:strike w:val="0"/>
+          <w:color w:val="000000"/>
+          <w:sz w:val="24"/>
+          <w:szCs w:val="24"/>
+          <w:u w:val="none"/>
+          <w:shd w:fill="auto" w:val="clear"/>
+          <w:vertAlign w:val="baseline"/>
+          <w:rtl w:val="0"/>
+        </w:rPr>
+        <w:t xml:space="preserve">“Hot Topics in AI and ICU EEG.” American Clinical Neurophysiology Society Annual Meeting, Austin, TX (2023)</w:t>
+      </w:r>
+    </w:p>
+    <w:p>
+      <w:pPr>
+        <w:keepNext w:val="0"/>
+        <w:keepLines w:val="0"/>
+        <w:pageBreakBefore w:val="0"/>
+        <w:widowControl w:val="1"/>
+        <w:numPr>
+          <w:ilvl w:val="0"/>
+          <w:numId w:val="9"/>
+        </w:numPr>
+        <w:pBdr>
+          <w:top w:space="0" w:sz="0" w:val="nil"/>
+          <w:left w:space="0" w:sz="0" w:val="nil"/>
+          <w:bottom w:space="0" w:sz="0" w:val="nil"/>
+          <w:right w:space="0" w:sz="0" w:val="nil"/>
+          <w:between w:space="0" w:sz="0" w:val="nil"/>
+        </w:pBdr>
+        <w:shd w:fill="auto" w:val="clear"/>
+        <w:tabs>
+          <w:tab w:val="left" w:leader="none" w:pos="720"/>
+          <w:tab w:val="left" w:leader="none" w:pos="1080"/>
+        </w:tabs>
+        <w:spacing w:after="0" w:before="0" w:line="240" w:lineRule="auto"/>
+        <w:ind w:left="720" w:right="0" w:hanging="360"/>
+        <w:jc w:val="left"/>
+        <w:rPr/>
+      </w:pPr>
+      <w:r>
+        <w:rPr>
+          <w:rFonts w:ascii="Times New Roman" w:cs="Times New Roman" w:eastAsia="Times New Roman" w:hAnsi="Times New Roman"/>
+          <w:b w:val="0"/>
+          <w:bCs w:val="0"/>
+          <w:i w:val="0"/>
+          <w:iCs w:val="0"/>
+          <w:smallCaps w:val="0"/>
+          <w:strike w:val="0"/>
+          <w:color w:val="000000"/>
+          <w:sz w:val="24"/>
+          <w:szCs w:val="24"/>
+          <w:u w:val="none"/>
+          <w:shd w:fill="auto" w:val="clear"/>
+          <w:vertAlign w:val="baseline"/>
+          <w:rtl w:val="0"/>
+        </w:rPr>
+        <w:t xml:space="preserve">“Collaborating with Industry.” American Clinical Neurophysiology Society Annual Meeting, Orlando, FL (2024)</w:t>
+      </w:r>
+    </w:p>
+    <w:p>
+      <w:pPr>
+        <w:keepNext w:val="0"/>
+        <w:keepLines w:val="0"/>
+        <w:pageBreakBefore w:val="0"/>
+        <w:widowControl w:val="1"/>
+        <w:numPr>
+          <w:ilvl w:val="0"/>
+          <w:numId w:val="9"/>
+        </w:numPr>
+        <w:pBdr>
+          <w:top w:space="0" w:sz="0" w:val="nil"/>
+          <w:left w:space="0" w:sz="0" w:val="nil"/>
+          <w:bottom w:space="0" w:sz="0" w:val="nil"/>
+          <w:right w:space="0" w:sz="0" w:val="nil"/>
+          <w:between w:space="0" w:sz="0" w:val="nil"/>
+        </w:pBdr>
+        <w:shd w:fill="auto" w:val="clear"/>
+        <w:tabs>
+          <w:tab w:val="left" w:leader="none" w:pos="720"/>
+          <w:tab w:val="left" w:leader="none" w:pos="1080"/>
+        </w:tabs>
+        <w:spacing w:after="0" w:before="0" w:line="240" w:lineRule="auto"/>
+        <w:ind w:left="720" w:right="0" w:hanging="360"/>
+        <w:jc w:val="left"/>
+        <w:rPr/>
+      </w:pPr>
+      <w:r>
+        <w:rPr>
+          <w:rFonts w:ascii="Times New Roman" w:cs="Times New Roman" w:eastAsia="Times New Roman" w:hAnsi="Times New Roman"/>
+          <w:b w:val="0"/>
+          <w:bCs w:val="0"/>
+          <w:i w:val="0"/>
+          <w:iCs w:val="0"/>
+          <w:smallCaps w:val="0"/>
+          <w:strike w:val="0"/>
+          <w:color w:val="000000"/>
+          <w:sz w:val="24"/>
+          <w:szCs w:val="24"/>
+          <w:u w:val="none"/>
+          <w:shd w:fill="auto" w:val="clear"/>
+          <w:vertAlign w:val="baseline"/>
+          <w:rtl w:val="0"/>
+        </w:rPr>
+        <w:t xml:space="preserve">“Quantitative EEG.” American Clinical Neurophysiology Society Annual Meeting, Orlando, FL (2024)</w:t>
+      </w:r>
+    </w:p>
+    <w:p>
+      <w:pPr>
+        <w:keepNext w:val="0"/>
+        <w:keepLines w:val="0"/>
+        <w:pageBreakBefore w:val="0"/>
+        <w:widowControl w:val="1"/>
+        <w:numPr>
+          <w:ilvl w:val="0"/>
+          <w:numId w:val="9"/>
+        </w:numPr>
+        <w:pBdr>
+          <w:top w:space="0" w:sz="0" w:val="nil"/>
+          <w:left w:space="0" w:sz="0" w:val="nil"/>
+          <w:bottom w:space="0" w:sz="0" w:val="nil"/>
+          <w:right w:space="0" w:sz="0" w:val="nil"/>
+          <w:between w:space="0" w:sz="0" w:val="nil"/>
+        </w:pBdr>
+        <w:shd w:fill="auto" w:val="clear"/>
+        <w:tabs>
+          <w:tab w:val="left" w:leader="none" w:pos="720"/>
+          <w:tab w:val="left" w:leader="none" w:pos="1080"/>
+        </w:tabs>
+        <w:spacing w:after="0" w:before="0" w:line="240" w:lineRule="auto"/>
+        <w:ind w:left="720" w:right="0" w:hanging="360"/>
+        <w:jc w:val="left"/>
+        <w:rPr/>
+      </w:pPr>
+      <w:r>
+        <w:rPr>
+          <w:rFonts w:ascii="Times New Roman" w:cs="Times New Roman" w:eastAsia="Times New Roman" w:hAnsi="Times New Roman"/>
+          <w:b w:val="0"/>
+          <w:bCs w:val="0"/>
+          <w:i w:val="0"/>
+          <w:iCs w:val="0"/>
+          <w:smallCaps w:val="0"/>
+          <w:strike w:val="0"/>
+          <w:color w:val="000000"/>
+          <w:sz w:val="24"/>
+          <w:szCs w:val="24"/>
+          <w:u w:val="none"/>
+          <w:shd w:fill="auto" w:val="clear"/>
+          <w:vertAlign w:val="baseline"/>
+          <w:rtl w:val="0"/>
+        </w:rPr>
+        <w:t xml:space="preserve">“The EEG Map of Everything (MOE).” Critical Care EEG Monitoring Research Consortium Meeting, Orlando, FL (2024)</w:t>
+      </w:r>
+    </w:p>
+    <w:p>
+      <w:pPr>
+        <w:keepNext w:val="0"/>
+        <w:keepLines w:val="0"/>
+        <w:pageBreakBefore w:val="0"/>
+        <w:widowControl w:val="1"/>
+        <w:numPr>
+          <w:ilvl w:val="0"/>
+          <w:numId w:val="9"/>
+        </w:numPr>
+        <w:pBdr>
+          <w:top w:space="0" w:sz="0" w:val="nil"/>
+          <w:left w:space="0" w:sz="0" w:val="nil"/>
+          <w:bottom w:space="0" w:sz="0" w:val="nil"/>
+          <w:right w:space="0" w:sz="0" w:val="nil"/>
+          <w:between w:space="0" w:sz="0" w:val="nil"/>
+        </w:pBdr>
+        <w:shd w:fill="auto" w:val="clear"/>
+        <w:tabs>
+          <w:tab w:val="left" w:leader="none" w:pos="720"/>
+          <w:tab w:val="left" w:leader="none" w:pos="1080"/>
+        </w:tabs>
+        <w:spacing w:after="0" w:before="0" w:line="240" w:lineRule="auto"/>
+        <w:ind w:left="720" w:right="0" w:hanging="360"/>
+        <w:jc w:val="left"/>
+        <w:rPr/>
+      </w:pPr>
+      <w:r>
+        <w:rPr>
+          <w:rFonts w:ascii="Times New Roman" w:cs="Times New Roman" w:eastAsia="Times New Roman" w:hAnsi="Times New Roman"/>
+          <w:b w:val="0"/>
+          <w:bCs w:val="0"/>
+          <w:i w:val="0"/>
+          <w:iCs w:val="0"/>
+          <w:smallCaps w:val="0"/>
+          <w:strike w:val="0"/>
+          <w:color w:val="000000"/>
+          <w:sz w:val="24"/>
+          <w:szCs w:val="24"/>
+          <w:u w:val="none"/>
+          <w:shd w:fill="auto" w:val="clear"/>
+          <w:vertAlign w:val="baseline"/>
+          <w:rtl w:val="0"/>
+        </w:rPr>
         <w:t xml:space="preserve">“AI in ICU EEG.” American Epilepsy Society Annual Meeting, Los Angeles, CA (2024)</w:t>
+      </w:r>
+    </w:p>
+    <w:p>
+      <w:pPr>
+        <w:keepNext w:val="0"/>
+        <w:keepLines w:val="0"/>
+        <w:pageBreakBefore w:val="0"/>
+        <w:widowControl w:val="1"/>
+        <w:numPr>
+          <w:ilvl w:val="0"/>
+          <w:numId w:val="9"/>
+        </w:numPr>
+        <w:pBdr>
+          <w:top w:space="0" w:sz="0" w:val="nil"/>
+          <w:left w:space="0" w:sz="0" w:val="nil"/>
+          <w:bottom w:space="0" w:sz="0" w:val="nil"/>
+          <w:right w:space="0" w:sz="0" w:val="nil"/>
+          <w:between w:space="0" w:sz="0" w:val="nil"/>
+        </w:pBdr>
+        <w:shd w:fill="auto" w:val="clear"/>
+        <w:tabs>
+          <w:tab w:val="left" w:leader="none" w:pos="720"/>
+          <w:tab w:val="left" w:leader="none" w:pos="1080"/>
+        </w:tabs>
+        <w:spacing w:after="0" w:before="0" w:line="240" w:lineRule="auto"/>
+        <w:ind w:left="720" w:right="0" w:hanging="360"/>
+        <w:jc w:val="left"/>
+        <w:rPr/>
+      </w:pPr>
+      <w:r>
+        <w:rPr>
+          <w:rFonts w:ascii="Times New Roman" w:cs="Times New Roman" w:eastAsia="Times New Roman" w:hAnsi="Times New Roman"/>
+          <w:b w:val="0"/>
+          <w:bCs w:val="0"/>
+          <w:i w:val="0"/>
+          <w:iCs w:val="0"/>
+          <w:smallCaps w:val="0"/>
+          <w:strike w:val="0"/>
+          <w:color w:val="000000"/>
+          <w:sz w:val="24"/>
+          <w:szCs w:val="24"/>
+          <w:u w:val="none"/>
+          <w:shd w:fill="auto" w:val="clear"/>
+          <w:vertAlign w:val="baseline"/>
+          <w:rtl w:val="0"/>
+        </w:rPr>
+        <w:t xml:space="preserve">“Big Data in Epilepsy Research.” NINDS Curing the Epilepsies Conference, Bethesda, MD (2026)</w:t>
       </w:r>
     </w:p>
     <w:p>

</xml_diff>

<commit_message>
CV: add nine more talks, Stanford appointment, updated editorial citation
Re-exported from the master Google Doc.

Co-Authored-By: Claude Opus 5.5 <noreply@anthropic.com>
</commit_message>
<xml_diff>
--- a/cv/1-Westover_CV.docx
+++ b/cv/1-Westover_CV.docx
@@ -518,7 +518,7 @@
         <w:rPr>
           <w:rtl w:val="0"/>
         </w:rPr>
-        <w:t xml:space="preserve">10/22 – present</w:t>
+        <w:t xml:space="preserve">10/22 – 5/26</w:t>
         <w:tab/>
         <w:t xml:space="preserve">Professor of Neurology, Harvard Medical School, Boston, MA</w:t>
       </w:r>
@@ -532,9 +532,23 @@
         <w:rPr>
           <w:rtl w:val="0"/>
         </w:rPr>
-        <w:t xml:space="preserve">11/22 – present</w:t>
+        <w:t xml:space="preserve">11/22 – 5/26</w:t>
         <w:tab/>
         <w:t xml:space="preserve">Emily Fisher Landau Professor of Neurology, Harvard Medical School, Boston, MA</w:t>
+      </w:r>
+    </w:p>
+    <w:p>
+      <w:pPr>
+        <w:ind w:left="2880" w:hanging="2880"/>
+        <w:rPr/>
+      </w:pPr>
+      <w:r>
+        <w:rPr>
+          <w:rtl w:val="0"/>
+        </w:rPr>
+        <w:t xml:space="preserve">5/26 – present</w:t>
+        <w:tab/>
+        <w:t xml:space="preserve">Professor of Neurology, Stanford University, Stanford, CA</w:t>
       </w:r>
     </w:p>
     <w:p>
@@ -2897,9 +2911,9 @@
         </w:rPr>
         <w:t xml:space="preserve">, “Data-Driven Modeling of Sleep States from EEG”</w:t>
       </w:r>
-      <w:bookmarkStart w:colFirst="0" w:colLast="0" w:name="biy3r5ssok4n" w:id="0"/>
+      <w:bookmarkStart w:colFirst="0" w:colLast="0" w:name="v18anhrnsl0v" w:id="0"/>
       <w:bookmarkEnd w:id="0"/>
-      <w:bookmarkStart w:colFirst="0" w:colLast="0" w:name="p1ytln4bqp2x" w:id="1"/>
+      <w:bookmarkStart w:colFirst="0" w:colLast="0" w:name="eqj4p9rh0s03" w:id="1"/>
       <w:bookmarkEnd w:id="1"/>
       <w:r>
         <w:rPr>
@@ -6957,7 +6971,7 @@
           <w:color w:val="000000"/>
         </w:rPr>
       </w:pPr>
-      <w:bookmarkStart w:colFirst="0" w:colLast="0" w:name="_ed7iao5i3412" w:id="2"/>
+      <w:bookmarkStart w:colFirst="0" w:colLast="0" w:name="_ndodg5xl8gwf" w:id="2"/>
       <w:bookmarkEnd w:id="2"/>
       <w:r>
         <w:rPr>
@@ -9866,7 +9880,7 @@
           <w:vertAlign w:val="baseline"/>
         </w:rPr>
       </w:pPr>
-      <w:bookmarkStart w:colFirst="0" w:colLast="0" w:name="_xqaknfw4iozr" w:id="3"/>
+      <w:bookmarkStart w:colFirst="0" w:colLast="0" w:name="_kgn82os1dk73" w:id="3"/>
       <w:bookmarkEnd w:id="3"/>
       <w:r>
         <w:rPr>
@@ -12421,7 +12435,7 @@
           <w:vertAlign w:val="baseline"/>
         </w:rPr>
       </w:pPr>
-      <w:bookmarkStart w:colFirst="0" w:colLast="0" w:name="_gi54j25v5xkd" w:id="4"/>
+      <w:bookmarkStart w:colFirst="0" w:colLast="0" w:name="_gbvi6jv7xk27" w:id="4"/>
       <w:bookmarkEnd w:id="4"/>
       <w:r>
         <w:rPr>
@@ -12831,7 +12845,7 @@
           <w:color w:val="000000"/>
         </w:rPr>
       </w:pPr>
-      <w:bookmarkStart w:colFirst="0" w:colLast="0" w:name="_faqb48wfnyd8" w:id="5"/>
+      <w:bookmarkStart w:colFirst="0" w:colLast="0" w:name="_f5xl07f2nvno" w:id="5"/>
       <w:bookmarkEnd w:id="5"/>
       <w:r>
         <w:rPr>
@@ -12885,7 +12899,7 @@
           <w:color w:val="000000"/>
         </w:rPr>
       </w:pPr>
-      <w:bookmarkStart w:colFirst="0" w:colLast="0" w:name="_cpxdlfnpgld4" w:id="6"/>
+      <w:bookmarkStart w:colFirst="0" w:colLast="0" w:name="_vgjk6e188upa" w:id="6"/>
       <w:bookmarkEnd w:id="6"/>
       <w:r>
         <w:rPr>
@@ -13529,7 +13543,7 @@
         </w:rPr>
         <w:t xml:space="preserve">. “EEG Classification via Convolutional Neural Network-Based Interictal Epileptiform Event Detection.” </w:t>
       </w:r>
-      <w:bookmarkStart w:colFirst="0" w:colLast="0" w:name="x44htwucvhfv" w:id="7"/>
+      <w:bookmarkStart w:colFirst="0" w:colLast="0" w:name="km4kacjymhvw" w:id="7"/>
       <w:bookmarkEnd w:id="7"/>
       <w:r>
         <w:rPr>
@@ -14725,7 +14739,7 @@
           <w:color w:val="000000"/>
         </w:rPr>
       </w:pPr>
-      <w:bookmarkStart w:colFirst="0" w:colLast="0" w:name="_jrzm22ecjohu" w:id="8"/>
+      <w:bookmarkStart w:colFirst="0" w:colLast="0" w:name="_z4nhrpk1e7g9" w:id="8"/>
       <w:bookmarkEnd w:id="8"/>
       <w:r>
         <w:rPr>
@@ -14779,7 +14793,7 @@
           <w:color w:val="000000"/>
         </w:rPr>
       </w:pPr>
-      <w:bookmarkStart w:colFirst="0" w:colLast="0" w:name="_dzlkdt7hhwmj" w:id="9"/>
+      <w:bookmarkStart w:colFirst="0" w:colLast="0" w:name="_swd0qzw5k9lr" w:id="9"/>
       <w:bookmarkEnd w:id="9"/>
       <w:r>
         <w:rPr>
@@ -14845,7 +14859,7 @@
           <w:color w:val="000000"/>
         </w:rPr>
       </w:pPr>
-      <w:bookmarkStart w:colFirst="0" w:colLast="0" w:name="_a63vlkops1le" w:id="10"/>
+      <w:bookmarkStart w:colFirst="0" w:colLast="0" w:name="_verejsh86fps" w:id="10"/>
       <w:bookmarkEnd w:id="10"/>
       <w:r>
         <w:rPr>
@@ -15172,7 +15186,7 @@
           <w:color w:val="000000"/>
         </w:rPr>
       </w:pPr>
-      <w:bookmarkStart w:colFirst="0" w:colLast="0" w:name="_hex00sx5q660" w:id="11"/>
+      <w:bookmarkStart w:colFirst="0" w:colLast="0" w:name="_uvkonnllo8rd" w:id="11"/>
       <w:bookmarkEnd w:id="11"/>
       <w:r>
         <w:rPr>
@@ -16137,7 +16151,7 @@
           <w:vertAlign w:val="baseline"/>
         </w:rPr>
       </w:pPr>
-      <w:bookmarkStart w:colFirst="0" w:colLast="0" w:name="_lx64eklqnhwb" w:id="12"/>
+      <w:bookmarkStart w:colFirst="0" w:colLast="0" w:name="_ihxmwxnsueop" w:id="12"/>
       <w:bookmarkEnd w:id="12"/>
       <w:r>
         <w:rPr>
@@ -16326,7 +16340,7 @@
         <w:ind w:left="480" w:hanging="360"/>
         <w:rPr/>
       </w:pPr>
-      <w:bookmarkStart w:colFirst="0" w:colLast="0" w:name="_n1jvye4n9g55" w:id="13"/>
+      <w:bookmarkStart w:colFirst="0" w:colLast="0" w:name="_fl6u3hr36ige" w:id="13"/>
       <w:bookmarkEnd w:id="13"/>
       <w:r>
         <w:rPr>
@@ -16449,7 +16463,7 @@
         <w:ind w:left="480" w:hanging="360"/>
         <w:rPr/>
       </w:pPr>
-      <w:bookmarkStart w:colFirst="0" w:colLast="0" w:name="_ujjjj0jh7fw8" w:id="14"/>
+      <w:bookmarkStart w:colFirst="0" w:colLast="0" w:name="_rh3j9199v4ow" w:id="14"/>
       <w:bookmarkEnd w:id="14"/>
       <w:r>
         <w:rPr>
@@ -16859,7 +16873,7 @@
           <w:vertAlign w:val="baseline"/>
         </w:rPr>
       </w:pPr>
-      <w:bookmarkStart w:colFirst="0" w:colLast="0" w:name="_3qqasjrod93n" w:id="15"/>
+      <w:bookmarkStart w:colFirst="0" w:colLast="0" w:name="_xe5vnb9cmbnc" w:id="15"/>
       <w:bookmarkEnd w:id="15"/>
       <w:r>
         <w:rPr>
@@ -18023,7 +18037,7 @@
         <w:jc w:val="left"/>
         <w:rPr/>
       </w:pPr>
-      <w:bookmarkStart w:colFirst="0" w:colLast="0" w:name="_khu1wppopfoi" w:id="16"/>
+      <w:bookmarkStart w:colFirst="0" w:colLast="0" w:name="_idiszk8tskad" w:id="16"/>
       <w:bookmarkEnd w:id="16"/>
       <w:r>
         <w:rPr>
@@ -18554,7 +18568,7 @@
         <w:jc w:val="left"/>
         <w:rPr/>
       </w:pPr>
-      <w:bookmarkStart w:colFirst="0" w:colLast="0" w:name="_ij5db82rl3ab" w:id="17"/>
+      <w:bookmarkStart w:colFirst="0" w:colLast="0" w:name="_hgyz6vowi1l8" w:id="17"/>
       <w:bookmarkEnd w:id="17"/>
       <w:r>
         <w:rPr>
@@ -19023,7 +19037,7 @@
         <w:jc w:val="left"/>
         <w:rPr/>
       </w:pPr>
-      <w:bookmarkStart w:colFirst="0" w:colLast="0" w:name="_or8cdw3xvnbs" w:id="18"/>
+      <w:bookmarkStart w:colFirst="0" w:colLast="0" w:name="_wrdjzfucjpm6" w:id="18"/>
       <w:bookmarkEnd w:id="18"/>
       <w:r>
         <w:rPr>
@@ -19711,7 +19725,7 @@
           <w:vertAlign w:val="baseline"/>
         </w:rPr>
       </w:pPr>
-      <w:bookmarkStart w:colFirst="0" w:colLast="0" w:name="_v8sxv8qytst2" w:id="19"/>
+      <w:bookmarkStart w:colFirst="0" w:colLast="0" w:name="_naie6vovt5fs" w:id="19"/>
       <w:bookmarkEnd w:id="19"/>
       <w:r>
         <w:rPr>
@@ -21000,7 +21014,7 @@
           <w:vertAlign w:val="baseline"/>
         </w:rPr>
       </w:pPr>
-      <w:bookmarkStart w:colFirst="0" w:colLast="0" w:name="_f57w1bhrqv0i" w:id="20"/>
+      <w:bookmarkStart w:colFirst="0" w:colLast="0" w:name="_ux90m2ojxjql" w:id="20"/>
       <w:bookmarkEnd w:id="20"/>
       <w:r>
         <w:rPr>
@@ -21979,7 +21993,7 @@
         <w:jc w:val="left"/>
         <w:rPr/>
       </w:pPr>
-      <w:bookmarkStart w:colFirst="0" w:colLast="0" w:name="_72p4bgfj7v7s" w:id="21"/>
+      <w:bookmarkStart w:colFirst="0" w:colLast="0" w:name="_u2hiq7e0mwbf" w:id="21"/>
       <w:bookmarkEnd w:id="21"/>
       <w:r>
         <w:rPr>
@@ -22610,7 +22624,7 @@
         <w:jc w:val="left"/>
         <w:rPr/>
       </w:pPr>
-      <w:bookmarkStart w:colFirst="0" w:colLast="0" w:name="_i7q92tmi80qf" w:id="22"/>
+      <w:bookmarkStart w:colFirst="0" w:colLast="0" w:name="_r7qveb9862jk" w:id="22"/>
       <w:bookmarkEnd w:id="22"/>
       <w:r>
         <w:rPr>
@@ -23712,7 +23726,7 @@
         <w:jc w:val="left"/>
         <w:rPr/>
       </w:pPr>
-      <w:bookmarkStart w:colFirst="0" w:colLast="0" w:name="_ymng98ebbxus" w:id="23"/>
+      <w:bookmarkStart w:colFirst="0" w:colLast="0" w:name="_v9heoi7ziv0r" w:id="23"/>
       <w:bookmarkEnd w:id="23"/>
       <w:r>
         <w:rPr>
@@ -24815,7 +24829,7 @@
         <w:jc w:val="left"/>
         <w:rPr/>
       </w:pPr>
-      <w:bookmarkStart w:colFirst="0" w:colLast="0" w:name="_lrxhrfvdud89" w:id="24"/>
+      <w:bookmarkStart w:colFirst="0" w:colLast="0" w:name="_4mvjz5fhgprh" w:id="24"/>
       <w:bookmarkEnd w:id="24"/>
       <w:r>
         <w:rPr>
@@ -25308,7 +25322,7 @@
         <w:jc w:val="left"/>
         <w:rPr/>
       </w:pPr>
-      <w:bookmarkStart w:colFirst="0" w:colLast="0" w:name="_oc82b7l02hcw" w:id="25"/>
+      <w:bookmarkStart w:colFirst="0" w:colLast="0" w:name="_9pexghipxknc" w:id="25"/>
       <w:bookmarkEnd w:id="25"/>
       <w:r>
         <w:rPr>
@@ -43915,7 +43929,7 @@
         <w:rPr>
           <w:rtl w:val="0"/>
         </w:rPr>
-        <w:t xml:space="preserve">, Thomas RJ. "Sleep as a Window into Brain Health: Clinical Implications from the Sleeping Brain Wave-Structure Associations." SLEEP. 2025 May. (Editorial).</w:t>
+        <w:t xml:space="preserve">, Thomas RJ. "Sleep as a Window into Brain Health: Clinical Implications from the Sleeping Brain Wave-Structure Associations." SLEEP. 2025 Aug;48(8):zsaf127. doi: 10.1093/sleep/zsaf127. PMID: 40355550; PMCID: PMC12351272. (Editorial).</w:t>
       </w:r>
       <w:r>
         <w:rPr>
@@ -48282,6 +48296,67 @@
           <w:rtl w:val="0"/>
         </w:rPr>
         <w:t xml:space="preserve">“Automatic Detection of Nonconvulsive Seizures.” BIDMC Research Day, Boston, MA (2023)</w:t>
+      </w:r>
+    </w:p>
+    <w:p>
+      <w:pPr>
+        <w:keepNext w:val="0"/>
+        <w:keepLines w:val="0"/>
+        <w:pageBreakBefore w:val="0"/>
+        <w:widowControl w:val="1"/>
+        <w:numPr>
+          <w:ilvl w:val="0"/>
+          <w:numId w:val="8"/>
+        </w:numPr>
+        <w:pBdr>
+          <w:top w:space="0" w:sz="0" w:val="nil"/>
+          <w:left w:space="0" w:sz="0" w:val="nil"/>
+          <w:bottom w:space="0" w:sz="0" w:val="nil"/>
+          <w:right w:space="0" w:sz="0" w:val="nil"/>
+          <w:between w:space="0" w:sz="0" w:val="nil"/>
+        </w:pBdr>
+        <w:shd w:fill="auto" w:val="clear"/>
+        <w:tabs>
+          <w:tab w:val="left" w:leader="none" w:pos="360"/>
+          <w:tab w:val="left" w:leader="none" w:pos="1080"/>
+        </w:tabs>
+        <w:spacing w:after="0" w:before="0" w:line="240" w:lineRule="auto"/>
+        <w:ind w:left="720" w:right="0" w:hanging="360"/>
+        <w:jc w:val="left"/>
+        <w:rPr>
+          <w:rFonts w:ascii="Times New Roman" w:cs="Times New Roman" w:eastAsia="Times New Roman" w:hAnsi="Times New Roman"/>
+          <w:b w:val="0"/>
+          <w:bCs w:val="0"/>
+          <w:i w:val="0"/>
+          <w:iCs w:val="0"/>
+          <w:smallCaps w:val="0"/>
+          <w:strike w:val="0"/>
+          <w:color w:val="000000"/>
+          <w:sz w:val="24"/>
+          <w:szCs w:val="24"/>
+          <w:u w:val="none"/>
+          <w:shd w:fill="auto" w:val="clear"/>
+          <w:vertAlign w:val="baseline"/>
+        </w:rPr>
+      </w:pPr>
+      <w:r>
+        <w:rPr>
+          <w:rFonts w:ascii="Times New Roman" w:cs="Times New Roman" w:eastAsia="Times New Roman" w:hAnsi="Times New Roman"/>
+          <w:b w:val="0"/>
+          <w:bCs w:val="0"/>
+          <w:i w:val="0"/>
+          <w:iCs w:val="0"/>
+          <w:smallCaps w:val="0"/>
+          <w:strike w:val="0"/>
+          <w:color w:val="000000"/>
+          <w:sz w:val="24"/>
+          <w:szCs w:val="24"/>
+          <w:u w:val="none"/>
+          <w:shd w:fill="auto" w:val="clear"/>
+          <w:vertAlign w:val="baseline"/>
+          <w:rtl w:val="0"/>
+        </w:rPr>
+        <w:t xml:space="preserve">“Are We Still Worried AI Might Kill Us All? Yeah.” (with Alek Westover) BIDMC NeuroAI Special Interest Group, Boston, MA (2026)</w:t>
       </w:r>
     </w:p>
     <w:p>
@@ -49119,7 +49194,7 @@
           <w:vertAlign w:val="baseline"/>
           <w:rtl w:val="0"/>
         </w:rPr>
-        <w:t xml:space="preserve">“Epileptiform and Non-Epileptiform Findings in ICU Electroencephalography.” American Academy of Neurology Annual Meeting, Boston, MA (2023)</w:t>
+        <w:t xml:space="preserve">“Electroencephalogram-Based Brain Age and Its Relation with Cognitive Function and Sleep Quality.” American Federation for Aging Research (AFAR) Grantee Conference, Santa Barbara, CA (2022)</w:t>
       </w:r>
     </w:p>
     <w:p>
@@ -49166,7 +49241,7 @@
           <w:vertAlign w:val="baseline"/>
           <w:rtl w:val="0"/>
         </w:rPr>
-        <w:t xml:space="preserve">“Neurophysiological Grading of Encephalopathy.” American Academy of Neurology Annual Meeting, Boston, MA (2023)</w:t>
+        <w:t xml:space="preserve">“Spectrograms in ICU EEG.” American Clinical Neurophysiology Society Fall Course: ICU EEG Monitoring, San Diego, CA (2022)</w:t>
       </w:r>
     </w:p>
     <w:p>
@@ -49213,7 +49288,7 @@
           <w:vertAlign w:val="baseline"/>
           <w:rtl w:val="0"/>
         </w:rPr>
-        <w:t xml:space="preserve">“Identifying and Overcoming Barriers for Clinical Use of Artificial Intelligence in Sleep Medicine.” American Academy of Sleep Medicine Annual Meeting, Indianapolis, IN (2023)</w:t>
+        <w:t xml:space="preserve">“Denoising and Debiasing the Diagnosis of Epilepsy.” NESET Fall Educational Meeting, Quincy, MA (2022)</w:t>
       </w:r>
     </w:p>
     <w:p>
@@ -49260,7 +49335,7 @@
           <w:vertAlign w:val="baseline"/>
           <w:rtl w:val="0"/>
         </w:rPr>
-        <w:t xml:space="preserve">“Optimizing Treatment of Nonconvulsive Status Epilepticus.” American Epilepsy Society Annual Meeting, Orlando, FL (2023)</w:t>
+        <w:t xml:space="preserve">“Epileptiform and Non-Epileptiform Findings in ICU Electroencephalography.” American Academy of Neurology Annual Meeting, Boston, MA (2023)</w:t>
       </w:r>
     </w:p>
     <w:p>
@@ -49307,7 +49382,7 @@
           <w:vertAlign w:val="baseline"/>
           <w:rtl w:val="0"/>
         </w:rPr>
-        <w:t xml:space="preserve">“Multimodal Monitoring and Brain Monitoring for Ischemia.” American Clinical Neurophysiology Society Annual Meeting, Austin, TX (2023)</w:t>
+        <w:t xml:space="preserve">“Neurophysiological Grading of Encephalopathy.” American Academy of Neurology Annual Meeting, Boston, MA (2023)</w:t>
       </w:r>
     </w:p>
     <w:p>
@@ -49354,7 +49429,7 @@
           <w:vertAlign w:val="baseline"/>
           <w:rtl w:val="0"/>
         </w:rPr>
-        <w:t xml:space="preserve">“Hot Topics in AI and ICU EEG.” American Clinical Neurophysiology Society Annual Meeting, Austin, TX (2023)</w:t>
+        <w:t xml:space="preserve">“Identifying and Overcoming Barriers for Clinical Use of Artificial Intelligence in Sleep Medicine.” American Academy of Sleep Medicine Annual Meeting, Indianapolis, IN (2023)</w:t>
       </w:r>
     </w:p>
     <w:p>
@@ -49401,7 +49476,7 @@
           <w:vertAlign w:val="baseline"/>
           <w:rtl w:val="0"/>
         </w:rPr>
-        <w:t xml:space="preserve">“Collaborating with Industry.” American Clinical Neurophysiology Society Annual Meeting, Orlando, FL (2024)</w:t>
+        <w:t xml:space="preserve">“Optimizing Treatment of Nonconvulsive Status Epilepticus.” American Epilepsy Society Annual Meeting, Orlando, FL (2023)</w:t>
       </w:r>
     </w:p>
     <w:p>
@@ -49448,7 +49523,7 @@
           <w:vertAlign w:val="baseline"/>
           <w:rtl w:val="0"/>
         </w:rPr>
-        <w:t xml:space="preserve">“Quantitative EEG.” American Clinical Neurophysiology Society Annual Meeting, Orlando, FL (2024)</w:t>
+        <w:t xml:space="preserve">“Multimodal Monitoring and Brain Monitoring for Ischemia.” American Clinical Neurophysiology Society Annual Meeting, Austin, TX (2023)</w:t>
       </w:r>
     </w:p>
     <w:p>
@@ -49495,7 +49570,7 @@
           <w:vertAlign w:val="baseline"/>
           <w:rtl w:val="0"/>
         </w:rPr>
-        <w:t xml:space="preserve">“The EEG Map of Everything (MOE).” Critical Care EEG Monitoring Research Consortium Meeting, Orlando, FL (2024)</w:t>
+        <w:t xml:space="preserve">“Hot Topics in AI and ICU EEG.” American Clinical Neurophysiology Society Annual Meeting, Austin, TX (2023)</w:t>
       </w:r>
     </w:p>
     <w:p>
@@ -49542,7 +49617,7 @@
           <w:vertAlign w:val="baseline"/>
           <w:rtl w:val="0"/>
         </w:rPr>
-        <w:t xml:space="preserve">“AI in ICU EEG.” American Epilepsy Society Annual Meeting, Los Angeles, CA (2024)</w:t>
+        <w:t xml:space="preserve">“Collaborating with Industry.” American Clinical Neurophysiology Society Annual Meeting, Orlando, FL (2024)</w:t>
       </w:r>
     </w:p>
     <w:p>
@@ -49589,6 +49664,194 @@
           <w:vertAlign w:val="baseline"/>
           <w:rtl w:val="0"/>
         </w:rPr>
+        <w:t xml:space="preserve">“Quantitative EEG.” American Clinical Neurophysiology Society Annual Meeting, Orlando, FL (2024)</w:t>
+      </w:r>
+    </w:p>
+    <w:p>
+      <w:pPr>
+        <w:keepNext w:val="0"/>
+        <w:keepLines w:val="0"/>
+        <w:pageBreakBefore w:val="0"/>
+        <w:widowControl w:val="1"/>
+        <w:numPr>
+          <w:ilvl w:val="0"/>
+          <w:numId w:val="9"/>
+        </w:numPr>
+        <w:pBdr>
+          <w:top w:space="0" w:sz="0" w:val="nil"/>
+          <w:left w:space="0" w:sz="0" w:val="nil"/>
+          <w:bottom w:space="0" w:sz="0" w:val="nil"/>
+          <w:right w:space="0" w:sz="0" w:val="nil"/>
+          <w:between w:space="0" w:sz="0" w:val="nil"/>
+        </w:pBdr>
+        <w:shd w:fill="auto" w:val="clear"/>
+        <w:tabs>
+          <w:tab w:val="left" w:leader="none" w:pos="720"/>
+          <w:tab w:val="left" w:leader="none" w:pos="1080"/>
+        </w:tabs>
+        <w:spacing w:after="0" w:before="0" w:line="240" w:lineRule="auto"/>
+        <w:ind w:left="720" w:right="0" w:hanging="360"/>
+        <w:jc w:val="left"/>
+        <w:rPr/>
+      </w:pPr>
+      <w:r>
+        <w:rPr>
+          <w:rFonts w:ascii="Times New Roman" w:cs="Times New Roman" w:eastAsia="Times New Roman" w:hAnsi="Times New Roman"/>
+          <w:b w:val="0"/>
+          <w:bCs w:val="0"/>
+          <w:i w:val="0"/>
+          <w:iCs w:val="0"/>
+          <w:smallCaps w:val="0"/>
+          <w:strike w:val="0"/>
+          <w:color w:val="000000"/>
+          <w:sz w:val="24"/>
+          <w:szCs w:val="24"/>
+          <w:u w:val="none"/>
+          <w:shd w:fill="auto" w:val="clear"/>
+          <w:vertAlign w:val="baseline"/>
+          <w:rtl w:val="0"/>
+        </w:rPr>
+        <w:t xml:space="preserve">“The EEG Map of Everything (MOE).” Critical Care EEG Monitoring Research Consortium Meeting, Orlando, FL (2024)</w:t>
+      </w:r>
+    </w:p>
+    <w:p>
+      <w:pPr>
+        <w:keepNext w:val="0"/>
+        <w:keepLines w:val="0"/>
+        <w:pageBreakBefore w:val="0"/>
+        <w:widowControl w:val="1"/>
+        <w:numPr>
+          <w:ilvl w:val="0"/>
+          <w:numId w:val="9"/>
+        </w:numPr>
+        <w:pBdr>
+          <w:top w:space="0" w:sz="0" w:val="nil"/>
+          <w:left w:space="0" w:sz="0" w:val="nil"/>
+          <w:bottom w:space="0" w:sz="0" w:val="nil"/>
+          <w:right w:space="0" w:sz="0" w:val="nil"/>
+          <w:between w:space="0" w:sz="0" w:val="nil"/>
+        </w:pBdr>
+        <w:shd w:fill="auto" w:val="clear"/>
+        <w:tabs>
+          <w:tab w:val="left" w:leader="none" w:pos="720"/>
+          <w:tab w:val="left" w:leader="none" w:pos="1080"/>
+        </w:tabs>
+        <w:spacing w:after="0" w:before="0" w:line="240" w:lineRule="auto"/>
+        <w:ind w:left="720" w:right="0" w:hanging="360"/>
+        <w:jc w:val="left"/>
+        <w:rPr/>
+      </w:pPr>
+      <w:r>
+        <w:rPr>
+          <w:rFonts w:ascii="Times New Roman" w:cs="Times New Roman" w:eastAsia="Times New Roman" w:hAnsi="Times New Roman"/>
+          <w:b w:val="0"/>
+          <w:bCs w:val="0"/>
+          <w:i w:val="0"/>
+          <w:iCs w:val="0"/>
+          <w:smallCaps w:val="0"/>
+          <w:strike w:val="0"/>
+          <w:color w:val="000000"/>
+          <w:sz w:val="24"/>
+          <w:szCs w:val="24"/>
+          <w:u w:val="none"/>
+          <w:shd w:fill="auto" w:val="clear"/>
+          <w:vertAlign w:val="baseline"/>
+          <w:rtl w:val="0"/>
+        </w:rPr>
+        <w:t xml:space="preserve">“AI in ICU EEG.” American Epilepsy Society Annual Meeting, Los Angeles, CA (2024)</w:t>
+      </w:r>
+    </w:p>
+    <w:p>
+      <w:pPr>
+        <w:keepNext w:val="0"/>
+        <w:keepLines w:val="0"/>
+        <w:pageBreakBefore w:val="0"/>
+        <w:widowControl w:val="1"/>
+        <w:numPr>
+          <w:ilvl w:val="0"/>
+          <w:numId w:val="9"/>
+        </w:numPr>
+        <w:pBdr>
+          <w:top w:space="0" w:sz="0" w:val="nil"/>
+          <w:left w:space="0" w:sz="0" w:val="nil"/>
+          <w:bottom w:space="0" w:sz="0" w:val="nil"/>
+          <w:right w:space="0" w:sz="0" w:val="nil"/>
+          <w:between w:space="0" w:sz="0" w:val="nil"/>
+        </w:pBdr>
+        <w:shd w:fill="auto" w:val="clear"/>
+        <w:tabs>
+          <w:tab w:val="left" w:leader="none" w:pos="720"/>
+          <w:tab w:val="left" w:leader="none" w:pos="1080"/>
+        </w:tabs>
+        <w:spacing w:after="0" w:before="0" w:line="240" w:lineRule="auto"/>
+        <w:ind w:left="720" w:right="0" w:hanging="360"/>
+        <w:jc w:val="left"/>
+        <w:rPr/>
+      </w:pPr>
+      <w:r>
+        <w:rPr>
+          <w:rFonts w:ascii="Times New Roman" w:cs="Times New Roman" w:eastAsia="Times New Roman" w:hAnsi="Times New Roman"/>
+          <w:b w:val="0"/>
+          <w:bCs w:val="0"/>
+          <w:i w:val="0"/>
+          <w:iCs w:val="0"/>
+          <w:smallCaps w:val="0"/>
+          <w:strike w:val="0"/>
+          <w:color w:val="000000"/>
+          <w:sz w:val="24"/>
+          <w:szCs w:val="24"/>
+          <w:u w:val="none"/>
+          <w:shd w:fill="auto" w:val="clear"/>
+          <w:vertAlign w:val="baseline"/>
+          <w:rtl w:val="0"/>
+        </w:rPr>
+        <w:t xml:space="preserve">“Machine Learning Approaches to Studying Neurophysiology in LoUE.” Defining the Landscape of Late-Onset Unexplained Epilepsy Conference, South Casco, ME (2025)</w:t>
+      </w:r>
+    </w:p>
+    <w:p>
+      <w:pPr>
+        <w:keepNext w:val="0"/>
+        <w:keepLines w:val="0"/>
+        <w:pageBreakBefore w:val="0"/>
+        <w:widowControl w:val="1"/>
+        <w:numPr>
+          <w:ilvl w:val="0"/>
+          <w:numId w:val="9"/>
+        </w:numPr>
+        <w:pBdr>
+          <w:top w:space="0" w:sz="0" w:val="nil"/>
+          <w:left w:space="0" w:sz="0" w:val="nil"/>
+          <w:bottom w:space="0" w:sz="0" w:val="nil"/>
+          <w:right w:space="0" w:sz="0" w:val="nil"/>
+          <w:between w:space="0" w:sz="0" w:val="nil"/>
+        </w:pBdr>
+        <w:shd w:fill="auto" w:val="clear"/>
+        <w:tabs>
+          <w:tab w:val="left" w:leader="none" w:pos="720"/>
+          <w:tab w:val="left" w:leader="none" w:pos="1080"/>
+        </w:tabs>
+        <w:spacing w:after="0" w:before="0" w:line="240" w:lineRule="auto"/>
+        <w:ind w:left="720" w:right="0" w:hanging="360"/>
+        <w:jc w:val="left"/>
+        <w:rPr/>
+      </w:pPr>
+      <w:r>
+        <w:rPr>
+          <w:rFonts w:ascii="Times New Roman" w:cs="Times New Roman" w:eastAsia="Times New Roman" w:hAnsi="Times New Roman"/>
+          <w:b w:val="0"/>
+          <w:bCs w:val="0"/>
+          <w:i w:val="0"/>
+          <w:iCs w:val="0"/>
+          <w:smallCaps w:val="0"/>
+          <w:strike w:val="0"/>
+          <w:color w:val="000000"/>
+          <w:sz w:val="24"/>
+          <w:szCs w:val="24"/>
+          <w:u w:val="none"/>
+          <w:shd w:fill="auto" w:val="clear"/>
+          <w:vertAlign w:val="baseline"/>
+          <w:rtl w:val="0"/>
+        </w:rPr>
         <w:t xml:space="preserve">“Big Data in Epilepsy Research.” NINDS Curing the Epilepsies Conference, Bethesda, MD (2026)</w:t>
       </w:r>
     </w:p>
@@ -50175,6 +50438,194 @@
           <w:rtl w:val="0"/>
         </w:rPr>
         <w:t xml:space="preserve">“Quantifying the Ictal–Interictal Continuum.” International Conference on Technology and Analysis for Seizures (ICTALS), Bern, Switzerland (2022)</w:t>
+      </w:r>
+    </w:p>
+    <w:p>
+      <w:pPr>
+        <w:keepNext w:val="0"/>
+        <w:keepLines w:val="0"/>
+        <w:pageBreakBefore w:val="0"/>
+        <w:widowControl w:val="1"/>
+        <w:numPr>
+          <w:ilvl w:val="0"/>
+          <w:numId w:val="11"/>
+        </w:numPr>
+        <w:pBdr>
+          <w:top w:space="0" w:sz="0" w:val="nil"/>
+          <w:left w:space="0" w:sz="0" w:val="nil"/>
+          <w:bottom w:space="0" w:sz="0" w:val="nil"/>
+          <w:right w:space="0" w:sz="0" w:val="nil"/>
+          <w:between w:space="0" w:sz="0" w:val="nil"/>
+        </w:pBdr>
+        <w:shd w:fill="auto" w:val="clear"/>
+        <w:tabs>
+          <w:tab w:val="left" w:leader="none" w:pos="360"/>
+          <w:tab w:val="left" w:leader="none" w:pos="1080"/>
+        </w:tabs>
+        <w:spacing w:after="0" w:before="0" w:line="240" w:lineRule="auto"/>
+        <w:ind w:left="720" w:right="0" w:hanging="360"/>
+        <w:jc w:val="left"/>
+        <w:rPr/>
+      </w:pPr>
+      <w:r>
+        <w:rPr>
+          <w:rFonts w:ascii="Times New Roman" w:cs="Times New Roman" w:eastAsia="Times New Roman" w:hAnsi="Times New Roman"/>
+          <w:b w:val="0"/>
+          <w:bCs w:val="0"/>
+          <w:i w:val="0"/>
+          <w:iCs w:val="0"/>
+          <w:smallCaps w:val="0"/>
+          <w:strike w:val="0"/>
+          <w:color w:val="000000"/>
+          <w:sz w:val="24"/>
+          <w:szCs w:val="24"/>
+          <w:u w:val="none"/>
+          <w:shd w:fill="auto" w:val="clear"/>
+          <w:vertAlign w:val="baseline"/>
+          <w:rtl w:val="0"/>
+        </w:rPr>
+        <w:t xml:space="preserve">“The Brain Data Science Platform.” (with Junior Moura) International Epilepsy Data Ecosystem Workshop, Neuroscience School of Advanced Studies, Crans-Montana, Switzerland (2023)</w:t>
+      </w:r>
+    </w:p>
+    <w:p>
+      <w:pPr>
+        <w:keepNext w:val="0"/>
+        <w:keepLines w:val="0"/>
+        <w:pageBreakBefore w:val="0"/>
+        <w:widowControl w:val="1"/>
+        <w:numPr>
+          <w:ilvl w:val="0"/>
+          <w:numId w:val="11"/>
+        </w:numPr>
+        <w:pBdr>
+          <w:top w:space="0" w:sz="0" w:val="nil"/>
+          <w:left w:space="0" w:sz="0" w:val="nil"/>
+          <w:bottom w:space="0" w:sz="0" w:val="nil"/>
+          <w:right w:space="0" w:sz="0" w:val="nil"/>
+          <w:between w:space="0" w:sz="0" w:val="nil"/>
+        </w:pBdr>
+        <w:shd w:fill="auto" w:val="clear"/>
+        <w:tabs>
+          <w:tab w:val="left" w:leader="none" w:pos="360"/>
+          <w:tab w:val="left" w:leader="none" w:pos="1080"/>
+        </w:tabs>
+        <w:spacing w:after="0" w:before="0" w:line="240" w:lineRule="auto"/>
+        <w:ind w:left="720" w:right="0" w:hanging="360"/>
+        <w:jc w:val="left"/>
+        <w:rPr/>
+      </w:pPr>
+      <w:r>
+        <w:rPr>
+          <w:rFonts w:ascii="Times New Roman" w:cs="Times New Roman" w:eastAsia="Times New Roman" w:hAnsi="Times New Roman"/>
+          <w:b w:val="0"/>
+          <w:bCs w:val="0"/>
+          <w:i w:val="0"/>
+          <w:iCs w:val="0"/>
+          <w:smallCaps w:val="0"/>
+          <w:strike w:val="0"/>
+          <w:color w:val="000000"/>
+          <w:sz w:val="24"/>
+          <w:szCs w:val="24"/>
+          <w:u w:val="none"/>
+          <w:shd w:fill="auto" w:val="clear"/>
+          <w:vertAlign w:val="baseline"/>
+          <w:rtl w:val="0"/>
+        </w:rPr>
+        <w:t xml:space="preserve">“Quantitative EEG Primer.” Teaching Course: Continuous EEG Monitoring, International Congress of Clinical Neurophysiology (ICCN), Jakarta, Indonesia (2024)</w:t>
+      </w:r>
+    </w:p>
+    <w:p>
+      <w:pPr>
+        <w:keepNext w:val="0"/>
+        <w:keepLines w:val="0"/>
+        <w:pageBreakBefore w:val="0"/>
+        <w:widowControl w:val="1"/>
+        <w:numPr>
+          <w:ilvl w:val="0"/>
+          <w:numId w:val="11"/>
+        </w:numPr>
+        <w:pBdr>
+          <w:top w:space="0" w:sz="0" w:val="nil"/>
+          <w:left w:space="0" w:sz="0" w:val="nil"/>
+          <w:bottom w:space="0" w:sz="0" w:val="nil"/>
+          <w:right w:space="0" w:sz="0" w:val="nil"/>
+          <w:between w:space="0" w:sz="0" w:val="nil"/>
+        </w:pBdr>
+        <w:shd w:fill="auto" w:val="clear"/>
+        <w:tabs>
+          <w:tab w:val="left" w:leader="none" w:pos="360"/>
+          <w:tab w:val="left" w:leader="none" w:pos="1080"/>
+        </w:tabs>
+        <w:spacing w:after="0" w:before="0" w:line="240" w:lineRule="auto"/>
+        <w:ind w:left="720" w:right="0" w:hanging="360"/>
+        <w:jc w:val="left"/>
+        <w:rPr/>
+      </w:pPr>
+      <w:r>
+        <w:rPr>
+          <w:rFonts w:ascii="Times New Roman" w:cs="Times New Roman" w:eastAsia="Times New Roman" w:hAnsi="Times New Roman"/>
+          <w:b w:val="0"/>
+          <w:bCs w:val="0"/>
+          <w:i w:val="0"/>
+          <w:iCs w:val="0"/>
+          <w:smallCaps w:val="0"/>
+          <w:strike w:val="0"/>
+          <w:color w:val="000000"/>
+          <w:sz w:val="24"/>
+          <w:szCs w:val="24"/>
+          <w:u w:val="none"/>
+          <w:shd w:fill="auto" w:val="clear"/>
+          <w:vertAlign w:val="baseline"/>
+          <w:rtl w:val="0"/>
+        </w:rPr>
+        <w:t xml:space="preserve">“Urgent Treatment for Periodic Discharges in Critically Ill Patients Is Essential.” Controversies Session, International Congress of Clinical Neurophysiology (ICCN), Jakarta, Indonesia (2024)</w:t>
+      </w:r>
+    </w:p>
+    <w:p>
+      <w:pPr>
+        <w:keepNext w:val="0"/>
+        <w:keepLines w:val="0"/>
+        <w:pageBreakBefore w:val="0"/>
+        <w:widowControl w:val="1"/>
+        <w:numPr>
+          <w:ilvl w:val="0"/>
+          <w:numId w:val="11"/>
+        </w:numPr>
+        <w:pBdr>
+          <w:top w:space="0" w:sz="0" w:val="nil"/>
+          <w:left w:space="0" w:sz="0" w:val="nil"/>
+          <w:bottom w:space="0" w:sz="0" w:val="nil"/>
+          <w:right w:space="0" w:sz="0" w:val="nil"/>
+          <w:between w:space="0" w:sz="0" w:val="nil"/>
+        </w:pBdr>
+        <w:shd w:fill="auto" w:val="clear"/>
+        <w:tabs>
+          <w:tab w:val="left" w:leader="none" w:pos="360"/>
+          <w:tab w:val="left" w:leader="none" w:pos="1080"/>
+        </w:tabs>
+        <w:spacing w:after="0" w:before="0" w:line="240" w:lineRule="auto"/>
+        <w:ind w:left="720" w:right="0" w:hanging="360"/>
+        <w:jc w:val="left"/>
+        <w:rPr/>
+      </w:pPr>
+      <w:r>
+        <w:rPr>
+          <w:rFonts w:ascii="Times New Roman" w:cs="Times New Roman" w:eastAsia="Times New Roman" w:hAnsi="Times New Roman"/>
+          <w:b w:val="0"/>
+          <w:bCs w:val="0"/>
+          <w:i w:val="0"/>
+          <w:iCs w:val="0"/>
+          <w:smallCaps w:val="0"/>
+          <w:strike w:val="0"/>
+          <w:color w:val="000000"/>
+          <w:sz w:val="24"/>
+          <w:szCs w:val="24"/>
+          <w:u w:val="none"/>
+          <w:shd w:fill="auto" w:val="clear"/>
+          <w:vertAlign w:val="baseline"/>
+          <w:rtl w:val="0"/>
+        </w:rPr>
+        <w:t xml:space="preserve">“Using AI in Continuous EEG Monitoring.” Symposium: Using Artificial Intelligence in Clinical EEG, International Congress of Clinical Neurophysiology (ICCN), Jakarta, Indonesia (2024)</w:t>
       </w:r>
     </w:p>
     <w:p>

</xml_diff>

<commit_message>
Update Westover CV from master Google Doc (2026-10-11)
</commit_message>
<xml_diff>
--- a/cv/1-Westover_CV.docx
+++ b/cv/1-Westover_CV.docx
@@ -88,7 +88,7 @@
         </w:rPr>
         <w:t xml:space="preserve">Current Position</w:t>
         <w:tab/>
-        <w:t xml:space="preserve">Emily Fisher Landau Professor of Neurology, Harvard Medical School, Beth Israel Deaconess Medical Center (BIDMC)</w:t>
+        <w:t xml:space="preserve">Professor of Neurology, Stanford University</w:t>
       </w:r>
     </w:p>
     <w:p>
@@ -102,7 +102,7 @@
         </w:rPr>
         <w:t xml:space="preserve">Current Affiliation</w:t>
         <w:tab/>
-        <w:t xml:space="preserve">Beth Israel Deaconess Medical Center (BIDMC)</w:t>
+        <w:t xml:space="preserve">Stanford University</w:t>
       </w:r>
     </w:p>
     <w:p>
@@ -939,24 +939,7 @@
           <w:bCs w:val="1"/>
           <w:rtl w:val="0"/>
         </w:rPr>
-        <w:t xml:space="preserve">Peer-reviewed original research (442 total, </w:t>
-      </w:r>
-      <w:r>
-        <w:rPr>
-          <w:b w:val="1"/>
-          <w:bCs w:val="1"/>
-          <w:highlight w:val="yellow"/>
-          <w:rtl w:val="0"/>
-        </w:rPr>
-        <w:t xml:space="preserve">5 in press, 10 submitted, 5 in review</w:t>
-      </w:r>
-      <w:r>
-        <w:rPr>
-          <w:b w:val="1"/>
-          <w:bCs w:val="1"/>
-          <w:rtl w:val="0"/>
-        </w:rPr>
-        <w:t xml:space="preserve">)</w:t>
+        <w:t xml:space="preserve">Peer-reviewed original research (442 total, 5 in press, 10 submitted, 5 in review)</w:t>
       </w:r>
     </w:p>
     <w:p>
@@ -2911,9 +2894,9 @@
         </w:rPr>
         <w:t xml:space="preserve">, “Data-Driven Modeling of Sleep States from EEG”</w:t>
       </w:r>
-      <w:bookmarkStart w:colFirst="0" w:colLast="0" w:name="v18anhrnsl0v" w:id="0"/>
+      <w:bookmarkStart w:colFirst="0" w:colLast="0" w:name="izzifk60ply" w:id="0"/>
       <w:bookmarkEnd w:id="0"/>
-      <w:bookmarkStart w:colFirst="0" w:colLast="0" w:name="eqj4p9rh0s03" w:id="1"/>
+      <w:bookmarkStart w:colFirst="0" w:colLast="0" w:name="6y7ggd5dwivw" w:id="1"/>
       <w:bookmarkEnd w:id="1"/>
       <w:r>
         <w:rPr>
@@ -6971,7 +6954,7 @@
           <w:color w:val="000000"/>
         </w:rPr>
       </w:pPr>
-      <w:bookmarkStart w:colFirst="0" w:colLast="0" w:name="_ndodg5xl8gwf" w:id="2"/>
+      <w:bookmarkStart w:colFirst="0" w:colLast="0" w:name="_v4je0mrra6ou" w:id="2"/>
       <w:bookmarkEnd w:id="2"/>
       <w:r>
         <w:rPr>
@@ -9880,7 +9863,7 @@
           <w:vertAlign w:val="baseline"/>
         </w:rPr>
       </w:pPr>
-      <w:bookmarkStart w:colFirst="0" w:colLast="0" w:name="_kgn82os1dk73" w:id="3"/>
+      <w:bookmarkStart w:colFirst="0" w:colLast="0" w:name="_ca2jg0b4twcm" w:id="3"/>
       <w:bookmarkEnd w:id="3"/>
       <w:r>
         <w:rPr>
@@ -12435,7 +12418,7 @@
           <w:vertAlign w:val="baseline"/>
         </w:rPr>
       </w:pPr>
-      <w:bookmarkStart w:colFirst="0" w:colLast="0" w:name="_gbvi6jv7xk27" w:id="4"/>
+      <w:bookmarkStart w:colFirst="0" w:colLast="0" w:name="_2kquwiogfv49" w:id="4"/>
       <w:bookmarkEnd w:id="4"/>
       <w:r>
         <w:rPr>
@@ -12845,7 +12828,7 @@
           <w:color w:val="000000"/>
         </w:rPr>
       </w:pPr>
-      <w:bookmarkStart w:colFirst="0" w:colLast="0" w:name="_f5xl07f2nvno" w:id="5"/>
+      <w:bookmarkStart w:colFirst="0" w:colLast="0" w:name="_73d5ykuj06yd" w:id="5"/>
       <w:bookmarkEnd w:id="5"/>
       <w:r>
         <w:rPr>
@@ -12899,7 +12882,7 @@
           <w:color w:val="000000"/>
         </w:rPr>
       </w:pPr>
-      <w:bookmarkStart w:colFirst="0" w:colLast="0" w:name="_vgjk6e188upa" w:id="6"/>
+      <w:bookmarkStart w:colFirst="0" w:colLast="0" w:name="_otxmckiq1u15" w:id="6"/>
       <w:bookmarkEnd w:id="6"/>
       <w:r>
         <w:rPr>
@@ -13543,7 +13526,7 @@
         </w:rPr>
         <w:t xml:space="preserve">. “EEG Classification via Convolutional Neural Network-Based Interictal Epileptiform Event Detection.” </w:t>
       </w:r>
-      <w:bookmarkStart w:colFirst="0" w:colLast="0" w:name="km4kacjymhvw" w:id="7"/>
+      <w:bookmarkStart w:colFirst="0" w:colLast="0" w:name="e5fxow7gqcs6" w:id="7"/>
       <w:bookmarkEnd w:id="7"/>
       <w:r>
         <w:rPr>
@@ -14739,7 +14722,7 @@
           <w:color w:val="000000"/>
         </w:rPr>
       </w:pPr>
-      <w:bookmarkStart w:colFirst="0" w:colLast="0" w:name="_z4nhrpk1e7g9" w:id="8"/>
+      <w:bookmarkStart w:colFirst="0" w:colLast="0" w:name="_47ctmnuove9t" w:id="8"/>
       <w:bookmarkEnd w:id="8"/>
       <w:r>
         <w:rPr>
@@ -14793,7 +14776,7 @@
           <w:color w:val="000000"/>
         </w:rPr>
       </w:pPr>
-      <w:bookmarkStart w:colFirst="0" w:colLast="0" w:name="_swd0qzw5k9lr" w:id="9"/>
+      <w:bookmarkStart w:colFirst="0" w:colLast="0" w:name="_uhdvgxxdsjxt" w:id="9"/>
       <w:bookmarkEnd w:id="9"/>
       <w:r>
         <w:rPr>
@@ -14859,7 +14842,7 @@
           <w:color w:val="000000"/>
         </w:rPr>
       </w:pPr>
-      <w:bookmarkStart w:colFirst="0" w:colLast="0" w:name="_verejsh86fps" w:id="10"/>
+      <w:bookmarkStart w:colFirst="0" w:colLast="0" w:name="_pgdeph85q33" w:id="10"/>
       <w:bookmarkEnd w:id="10"/>
       <w:r>
         <w:rPr>
@@ -15186,7 +15169,7 @@
           <w:color w:val="000000"/>
         </w:rPr>
       </w:pPr>
-      <w:bookmarkStart w:colFirst="0" w:colLast="0" w:name="_uvkonnllo8rd" w:id="11"/>
+      <w:bookmarkStart w:colFirst="0" w:colLast="0" w:name="_s9naj04j1vts" w:id="11"/>
       <w:bookmarkEnd w:id="11"/>
       <w:r>
         <w:rPr>
@@ -16151,7 +16134,7 @@
           <w:vertAlign w:val="baseline"/>
         </w:rPr>
       </w:pPr>
-      <w:bookmarkStart w:colFirst="0" w:colLast="0" w:name="_ihxmwxnsueop" w:id="12"/>
+      <w:bookmarkStart w:colFirst="0" w:colLast="0" w:name="_wdi47tcgi81r" w:id="12"/>
       <w:bookmarkEnd w:id="12"/>
       <w:r>
         <w:rPr>
@@ -16340,7 +16323,7 @@
         <w:ind w:left="480" w:hanging="360"/>
         <w:rPr/>
       </w:pPr>
-      <w:bookmarkStart w:colFirst="0" w:colLast="0" w:name="_fl6u3hr36ige" w:id="13"/>
+      <w:bookmarkStart w:colFirst="0" w:colLast="0" w:name="_5wsp62per404" w:id="13"/>
       <w:bookmarkEnd w:id="13"/>
       <w:r>
         <w:rPr>
@@ -16463,7 +16446,7 @@
         <w:ind w:left="480" w:hanging="360"/>
         <w:rPr/>
       </w:pPr>
-      <w:bookmarkStart w:colFirst="0" w:colLast="0" w:name="_rh3j9199v4ow" w:id="14"/>
+      <w:bookmarkStart w:colFirst="0" w:colLast="0" w:name="_8zts2r172765" w:id="14"/>
       <w:bookmarkEnd w:id="14"/>
       <w:r>
         <w:rPr>
@@ -16873,7 +16856,7 @@
           <w:vertAlign w:val="baseline"/>
         </w:rPr>
       </w:pPr>
-      <w:bookmarkStart w:colFirst="0" w:colLast="0" w:name="_xe5vnb9cmbnc" w:id="15"/>
+      <w:bookmarkStart w:colFirst="0" w:colLast="0" w:name="_kpi38s8xl5fl" w:id="15"/>
       <w:bookmarkEnd w:id="15"/>
       <w:r>
         <w:rPr>
@@ -18037,7 +18020,7 @@
         <w:jc w:val="left"/>
         <w:rPr/>
       </w:pPr>
-      <w:bookmarkStart w:colFirst="0" w:colLast="0" w:name="_idiszk8tskad" w:id="16"/>
+      <w:bookmarkStart w:colFirst="0" w:colLast="0" w:name="_di6ighqfok35" w:id="16"/>
       <w:bookmarkEnd w:id="16"/>
       <w:r>
         <w:rPr>
@@ -18568,7 +18551,7 @@
         <w:jc w:val="left"/>
         <w:rPr/>
       </w:pPr>
-      <w:bookmarkStart w:colFirst="0" w:colLast="0" w:name="_hgyz6vowi1l8" w:id="17"/>
+      <w:bookmarkStart w:colFirst="0" w:colLast="0" w:name="_oofiy52v9h9" w:id="17"/>
       <w:bookmarkEnd w:id="17"/>
       <w:r>
         <w:rPr>
@@ -19037,7 +19020,7 @@
         <w:jc w:val="left"/>
         <w:rPr/>
       </w:pPr>
-      <w:bookmarkStart w:colFirst="0" w:colLast="0" w:name="_wrdjzfucjpm6" w:id="18"/>
+      <w:bookmarkStart w:colFirst="0" w:colLast="0" w:name="_on64cf7zlnbv" w:id="18"/>
       <w:bookmarkEnd w:id="18"/>
       <w:r>
         <w:rPr>
@@ -19725,7 +19708,7 @@
           <w:vertAlign w:val="baseline"/>
         </w:rPr>
       </w:pPr>
-      <w:bookmarkStart w:colFirst="0" w:colLast="0" w:name="_naie6vovt5fs" w:id="19"/>
+      <w:bookmarkStart w:colFirst="0" w:colLast="0" w:name="_neo996r4cwue" w:id="19"/>
       <w:bookmarkEnd w:id="19"/>
       <w:r>
         <w:rPr>
@@ -21014,7 +20997,7 @@
           <w:vertAlign w:val="baseline"/>
         </w:rPr>
       </w:pPr>
-      <w:bookmarkStart w:colFirst="0" w:colLast="0" w:name="_ux90m2ojxjql" w:id="20"/>
+      <w:bookmarkStart w:colFirst="0" w:colLast="0" w:name="_phf171e8azad" w:id="20"/>
       <w:bookmarkEnd w:id="20"/>
       <w:r>
         <w:rPr>
@@ -21993,7 +21976,7 @@
         <w:jc w:val="left"/>
         <w:rPr/>
       </w:pPr>
-      <w:bookmarkStart w:colFirst="0" w:colLast="0" w:name="_u2hiq7e0mwbf" w:id="21"/>
+      <w:bookmarkStart w:colFirst="0" w:colLast="0" w:name="_txz7avqkaxk9" w:id="21"/>
       <w:bookmarkEnd w:id="21"/>
       <w:r>
         <w:rPr>
@@ -22624,7 +22607,7 @@
         <w:jc w:val="left"/>
         <w:rPr/>
       </w:pPr>
-      <w:bookmarkStart w:colFirst="0" w:colLast="0" w:name="_r7qveb9862jk" w:id="22"/>
+      <w:bookmarkStart w:colFirst="0" w:colLast="0" w:name="_7ncfrkleqz42" w:id="22"/>
       <w:bookmarkEnd w:id="22"/>
       <w:r>
         <w:rPr>
@@ -23726,7 +23709,7 @@
         <w:jc w:val="left"/>
         <w:rPr/>
       </w:pPr>
-      <w:bookmarkStart w:colFirst="0" w:colLast="0" w:name="_v9heoi7ziv0r" w:id="23"/>
+      <w:bookmarkStart w:colFirst="0" w:colLast="0" w:name="_oqcih2xrwlyr" w:id="23"/>
       <w:bookmarkEnd w:id="23"/>
       <w:r>
         <w:rPr>
@@ -24829,7 +24812,7 @@
         <w:jc w:val="left"/>
         <w:rPr/>
       </w:pPr>
-      <w:bookmarkStart w:colFirst="0" w:colLast="0" w:name="_4mvjz5fhgprh" w:id="24"/>
+      <w:bookmarkStart w:colFirst="0" w:colLast="0" w:name="_37a8lksjqg9u" w:id="24"/>
       <w:bookmarkEnd w:id="24"/>
       <w:r>
         <w:rPr>
@@ -25322,7 +25305,7 @@
         <w:jc w:val="left"/>
         <w:rPr/>
       </w:pPr>
-      <w:bookmarkStart w:colFirst="0" w:colLast="0" w:name="_9pexghipxknc" w:id="25"/>
+      <w:bookmarkStart w:colFirst="0" w:colLast="0" w:name="_eo6hd1l6v6dx" w:id="25"/>
       <w:bookmarkEnd w:id="25"/>
       <w:r>
         <w:rPr>
@@ -43158,6 +43141,11 @@
         </w:rPr>
         <w:t xml:space="preserve">. Sleep electroencephalography-derived brain health and long-term cognitive decline in community-dwelling adults. Sleep Adv. 2026;7(3):zpag089. doi: 10.1093/sleepadvances/zpag089. Epub 2026 Aug 06. PMID: 42769852; PMCID: PMC13592772.</w:t>
       </w:r>
+      <w:r>
+        <w:rPr>
+          <w:rtl w:val="0"/>
+        </w:rPr>
+      </w:r>
     </w:p>
     <w:p>
       <w:pPr>
@@ -43187,18 +43175,15 @@
           <w:color w:val="000000"/>
           <w:sz w:val="24"/>
           <w:szCs w:val="24"/>
-          <w:u w:val="none"/>
-          <w:shd w:fill="auto" w:val="clear"/>
-          <w:vertAlign w:val="baseline"/>
-        </w:rPr>
-      </w:pPr>
-      <w:r>
-        <w:rPr>
-          <w:rFonts w:ascii="Times New Roman" w:cs="Times New Roman" w:eastAsia="Times New Roman" w:hAnsi="Times New Roman"/>
-          <w:b w:val="0"/>
-          <w:bCs w:val="0"/>
-          <w:i w:val="0"/>
-          <w:iCs w:val="0"/>
+          <w:shd w:fill="auto" w:val="clear"/>
+          <w:vertAlign w:val="baseline"/>
+        </w:rPr>
+      </w:pPr>
+      <w:r>
+        <w:rPr>
+          <w:rFonts w:ascii="Times New Roman" w:cs="Times New Roman" w:eastAsia="Times New Roman" w:hAnsi="Times New Roman"/>
+          <w:b w:val="0"/>
+          <w:bCs w:val="0"/>
           <w:smallCaps w:val="0"/>
           <w:strike w:val="0"/>
           <w:color w:val="000000"/>
@@ -43213,11 +43198,8 @@
       </w:r>
       <w:r>
         <w:rPr>
-          <w:rFonts w:ascii="Times New Roman" w:cs="Times New Roman" w:eastAsia="Times New Roman" w:hAnsi="Times New Roman"/>
-          <w:b w:val="1"/>
-          <w:bCs w:val="1"/>
-          <w:i w:val="0"/>
-          <w:iCs w:val="0"/>
+          <w:b w:val="1"/>
+          <w:bCs w:val="1"/>
           <w:smallCaps w:val="0"/>
           <w:strike w:val="0"/>
           <w:color w:val="000000"/>
@@ -43235,8 +43217,6 @@
           <w:rFonts w:ascii="Times New Roman" w:cs="Times New Roman" w:eastAsia="Times New Roman" w:hAnsi="Times New Roman"/>
           <w:b w:val="0"/>
           <w:bCs w:val="0"/>
-          <w:i w:val="0"/>
-          <w:iCs w:val="0"/>
           <w:smallCaps w:val="0"/>
           <w:strike w:val="0"/>
           <w:color w:val="000000"/>
@@ -43248,6 +43228,11 @@
           <w:rtl w:val="0"/>
         </w:rPr>
         <w:t xml:space="preserve">, Fernandes M, Amorim E. Automated Derivation of Cerebral Performance Category at Hospital Discharge After Cardiac Arrest Using Natural Language Processing and Machine Learning. Neurocrit Care. 2026 Sep 28. doi: 10.1007/s12028-026-02650-9. Epub ahead of print. PMID: 42806261.</w:t>
+      </w:r>
+      <w:r>
+        <w:rPr>
+          <w:rtl w:val="0"/>
+        </w:rPr>
       </w:r>
     </w:p>
     <w:p>
@@ -46763,26 +46748,6 @@
           <w:rtl w:val="0"/>
         </w:rPr>
         <w:t xml:space="preserve">Grand Rounds:</w:t>
-      </w:r>
-    </w:p>
-    <w:p>
-      <w:pPr>
-        <w:numPr>
-          <w:ilvl w:val="0"/>
-          <w:numId w:val="10"/>
-        </w:numPr>
-        <w:tabs>
-          <w:tab w:val="left" w:leader="none" w:pos="720"/>
-          <w:tab w:val="left" w:leader="none" w:pos="1080"/>
-        </w:tabs>
-        <w:ind w:left="720" w:hanging="360"/>
-        <w:rPr/>
-      </w:pPr>
-      <w:r>
-        <w:rPr>
-          <w:rtl w:val="0"/>
-        </w:rPr>
-        <w:t xml:space="preserve">“Little; Yellow; Different:  Hyperbilirubinemia in preterm infants of lactating depressed female Green Monkeys receiving CACKLE-modified dairy supplements.”  Neonatology Grand Rounds, Stanford University, Stanford, CA (2022)</w:t>
       </w:r>
     </w:p>
     <w:p>
@@ -49852,6 +49817,53 @@
           <w:vertAlign w:val="baseline"/>
           <w:rtl w:val="0"/>
         </w:rPr>
+        <w:t xml:space="preserve">“Data-Driven Biomarkers for Brain Health from Sleep.” SLEEP 2025 Annual Meeting, Seattle, WA (2025)</w:t>
+      </w:r>
+    </w:p>
+    <w:p>
+      <w:pPr>
+        <w:keepNext w:val="0"/>
+        <w:keepLines w:val="0"/>
+        <w:pageBreakBefore w:val="0"/>
+        <w:widowControl w:val="1"/>
+        <w:numPr>
+          <w:ilvl w:val="0"/>
+          <w:numId w:val="9"/>
+        </w:numPr>
+        <w:pBdr>
+          <w:top w:space="0" w:sz="0" w:val="nil"/>
+          <w:left w:space="0" w:sz="0" w:val="nil"/>
+          <w:bottom w:space="0" w:sz="0" w:val="nil"/>
+          <w:right w:space="0" w:sz="0" w:val="nil"/>
+          <w:between w:space="0" w:sz="0" w:val="nil"/>
+        </w:pBdr>
+        <w:shd w:fill="auto" w:val="clear"/>
+        <w:tabs>
+          <w:tab w:val="left" w:leader="none" w:pos="720"/>
+          <w:tab w:val="left" w:leader="none" w:pos="1080"/>
+        </w:tabs>
+        <w:spacing w:after="0" w:before="0" w:line="240" w:lineRule="auto"/>
+        <w:ind w:left="720" w:right="0" w:hanging="360"/>
+        <w:jc w:val="left"/>
+        <w:rPr/>
+      </w:pPr>
+      <w:r>
+        <w:rPr>
+          <w:rFonts w:ascii="Times New Roman" w:cs="Times New Roman" w:eastAsia="Times New Roman" w:hAnsi="Times New Roman"/>
+          <w:b w:val="0"/>
+          <w:bCs w:val="0"/>
+          <w:i w:val="0"/>
+          <w:iCs w:val="0"/>
+          <w:smallCaps w:val="0"/>
+          <w:strike w:val="0"/>
+          <w:color w:val="000000"/>
+          <w:sz w:val="24"/>
+          <w:szCs w:val="24"/>
+          <w:u w:val="none"/>
+          <w:shd w:fill="auto" w:val="clear"/>
+          <w:vertAlign w:val="baseline"/>
+          <w:rtl w:val="0"/>
+        </w:rPr>
         <w:t xml:space="preserve">“Big Data in Epilepsy Research.” NINDS Curing the Epilepsies Conference, Bethesda, MD (2026)</w:t>
       </w:r>
     </w:p>
@@ -50720,53 +50732,6 @@
           <w:rtl w:val="0"/>
         </w:rPr>
         <w:t xml:space="preserve">“MORGOTH: Automating the Interpretation of Clinical Neurophysiology Tests.” International Conference on Technology and Analysis for Seizures (ICTALS), Montreal, Canada (2025)</w:t>
-      </w:r>
-    </w:p>
-    <w:p>
-      <w:pPr>
-        <w:keepNext w:val="0"/>
-        <w:keepLines w:val="0"/>
-        <w:pageBreakBefore w:val="0"/>
-        <w:widowControl w:val="1"/>
-        <w:numPr>
-          <w:ilvl w:val="0"/>
-          <w:numId w:val="11"/>
-        </w:numPr>
-        <w:pBdr>
-          <w:top w:space="0" w:sz="0" w:val="nil"/>
-          <w:left w:space="0" w:sz="0" w:val="nil"/>
-          <w:bottom w:space="0" w:sz="0" w:val="nil"/>
-          <w:right w:space="0" w:sz="0" w:val="nil"/>
-          <w:between w:space="0" w:sz="0" w:val="nil"/>
-        </w:pBdr>
-        <w:shd w:fill="auto" w:val="clear"/>
-        <w:tabs>
-          <w:tab w:val="left" w:leader="none" w:pos="360"/>
-          <w:tab w:val="left" w:leader="none" w:pos="1080"/>
-        </w:tabs>
-        <w:spacing w:after="0" w:before="0" w:line="240" w:lineRule="auto"/>
-        <w:ind w:left="720" w:right="0" w:hanging="360"/>
-        <w:jc w:val="left"/>
-        <w:rPr/>
-      </w:pPr>
-      <w:r>
-        <w:rPr>
-          <w:rFonts w:ascii="Times New Roman" w:cs="Times New Roman" w:eastAsia="Times New Roman" w:hAnsi="Times New Roman"/>
-          <w:b w:val="0"/>
-          <w:bCs w:val="0"/>
-          <w:i w:val="0"/>
-          <w:iCs w:val="0"/>
-          <w:smallCaps w:val="0"/>
-          <w:strike w:val="0"/>
-          <w:color w:val="000000"/>
-          <w:sz w:val="24"/>
-          <w:szCs w:val="24"/>
-          <w:u w:val="none"/>
-          <w:shd w:fill="auto" w:val="clear"/>
-          <w:vertAlign w:val="baseline"/>
-          <w:rtl w:val="0"/>
-        </w:rPr>
-        <w:t xml:space="preserve">“Data-Driven Biomarkers for Brain Health from Sleep.” SLEEP 2025 Annual Meeting, Seattle, WA (2025)</w:t>
       </w:r>
     </w:p>
     <w:p>

</xml_diff>

<commit_message>
Update Westover CV from master Google Doc (2026-10-18)
</commit_message>
<xml_diff>
--- a/cv/1-Westover_CV.docx
+++ b/cv/1-Westover_CV.docx
@@ -15,7 +15,7 @@
           <w:bCs w:val="1"/>
           <w:rtl w:val="0"/>
         </w:rPr>
-        <w:t xml:space="preserve">Curriculum Vitae: updated October 11, 2026</w:t>
+        <w:t xml:space="preserve">Curriculum Vitae: updated October 18, 2026</w:t>
       </w:r>
     </w:p>
     <w:p>
@@ -939,7 +939,7 @@
           <w:bCs w:val="1"/>
           <w:rtl w:val="0"/>
         </w:rPr>
-        <w:t xml:space="preserve">Peer-reviewed original research (443 total, 5 in press, 10 submitted, 5 in review)</w:t>
+        <w:t xml:space="preserve">Peer-reviewed original research (445 total, 5 in press, 10 submitted, 5 in review)</w:t>
       </w:r>
     </w:p>
     <w:p>
@@ -43319,6 +43319,172 @@
           <w:rtl w:val="0"/>
         </w:rPr>
         <w:t xml:space="preserve">. An adaptive, variable-length test for certifying electroencephalographic spike-detection skill: A retrospective feasibility study. Epilepsia. 2026 Oct 10. doi: 10.1002/epi.70519. Epub ahead of print. PMID: 42858246.</w:t>
+      </w:r>
+    </w:p>
+    <w:p>
+      <w:pPr>
+        <w:keepNext w:val="0"/>
+        <w:keepLines w:val="0"/>
+        <w:pageBreakBefore w:val="0"/>
+        <w:widowControl w:val="1"/>
+        <w:numPr>
+          <w:ilvl w:val="0"/>
+          <w:numId w:val="3"/>
+        </w:numPr>
+        <w:pBdr>
+          <w:top w:space="0" w:sz="0" w:val="nil"/>
+          <w:left w:space="0" w:sz="0" w:val="nil"/>
+          <w:bottom w:space="0" w:sz="0" w:val="nil"/>
+          <w:right w:space="0" w:sz="0" w:val="nil"/>
+          <w:between w:space="0" w:sz="0" w:val="nil"/>
+        </w:pBdr>
+        <w:shd w:fill="auto" w:val="clear"/>
+        <w:spacing w:after="0" w:before="0" w:line="240" w:lineRule="auto"/>
+        <w:ind w:left="480" w:right="0" w:hanging="360"/>
+        <w:jc w:val="left"/>
+        <w:rPr>
+          <w:rFonts w:ascii="Times New Roman" w:cs="Times New Roman" w:eastAsia="Times New Roman" w:hAnsi="Times New Roman"/>
+          <w:smallCaps w:val="0"/>
+          <w:strike w:val="0"/>
+          <w:color w:val="000000"/>
+          <w:sz w:val="24"/>
+          <w:szCs w:val="24"/>
+          <w:shd w:fill="auto" w:val="clear"/>
+          <w:vertAlign w:val="baseline"/>
+        </w:rPr>
+      </w:pPr>
+      <w:r>
+        <w:rPr>
+          <w:rFonts w:ascii="Times New Roman" w:cs="Times New Roman" w:eastAsia="Times New Roman" w:hAnsi="Times New Roman"/>
+          <w:b w:val="0"/>
+          <w:bCs w:val="0"/>
+          <w:smallCaps w:val="0"/>
+          <w:strike w:val="0"/>
+          <w:color w:val="000000"/>
+          <w:sz w:val="24"/>
+          <w:szCs w:val="24"/>
+          <w:u w:val="none"/>
+          <w:shd w:fill="auto" w:val="clear"/>
+          <w:vertAlign w:val="baseline"/>
+          <w:rtl w:val="0"/>
+        </w:rPr>
+        <w:t xml:space="preserve">Muqaddas S, Akras Z, Gallagher K, Sarami M, Yaramis AH, Akbar I, Haider Z, Wheelock J, Brace CJ, Philibert-Rosas S, Kim JA, Struck AF, </w:t>
+      </w:r>
+      <w:r>
+        <w:rPr>
+          <w:b w:val="1"/>
+          <w:bCs w:val="1"/>
+          <w:smallCaps w:val="0"/>
+          <w:strike w:val="0"/>
+          <w:color w:val="000000"/>
+          <w:sz w:val="24"/>
+          <w:szCs w:val="24"/>
+          <w:u w:val="none"/>
+          <w:shd w:fill="auto" w:val="clear"/>
+          <w:vertAlign w:val="baseline"/>
+          <w:rtl w:val="0"/>
+        </w:rPr>
+        <w:t xml:space="preserve">Westover MB</w:t>
+      </w:r>
+      <w:r>
+        <w:rPr>
+          <w:rFonts w:ascii="Times New Roman" w:cs="Times New Roman" w:eastAsia="Times New Roman" w:hAnsi="Times New Roman"/>
+          <w:b w:val="0"/>
+          <w:bCs w:val="0"/>
+          <w:smallCaps w:val="0"/>
+          <w:strike w:val="0"/>
+          <w:color w:val="000000"/>
+          <w:sz w:val="24"/>
+          <w:szCs w:val="24"/>
+          <w:u w:val="none"/>
+          <w:shd w:fill="auto" w:val="clear"/>
+          <w:vertAlign w:val="baseline"/>
+          <w:rtl w:val="0"/>
+        </w:rPr>
+        <w:t xml:space="preserve">, Zafar SF. Clinical and imaging correlates of lateralized rhythmic delta activity: A multicenter cohort study. Clin Neurophysiol. 2026 Sep 25:2112413. doi: 10.1016/j.clinph.2026.2112413. Epub ahead of print. PMID: 42864229.</w:t>
+      </w:r>
+    </w:p>
+    <w:p>
+      <w:pPr>
+        <w:keepNext w:val="0"/>
+        <w:keepLines w:val="0"/>
+        <w:pageBreakBefore w:val="0"/>
+        <w:widowControl w:val="1"/>
+        <w:numPr>
+          <w:ilvl w:val="0"/>
+          <w:numId w:val="3"/>
+        </w:numPr>
+        <w:pBdr>
+          <w:top w:space="0" w:sz="0" w:val="nil"/>
+          <w:left w:space="0" w:sz="0" w:val="nil"/>
+          <w:bottom w:space="0" w:sz="0" w:val="nil"/>
+          <w:right w:space="0" w:sz="0" w:val="nil"/>
+          <w:between w:space="0" w:sz="0" w:val="nil"/>
+        </w:pBdr>
+        <w:shd w:fill="auto" w:val="clear"/>
+        <w:spacing w:after="0" w:before="0" w:line="240" w:lineRule="auto"/>
+        <w:ind w:left="480" w:right="0" w:hanging="360"/>
+        <w:jc w:val="left"/>
+        <w:rPr>
+          <w:rFonts w:ascii="Times New Roman" w:cs="Times New Roman" w:eastAsia="Times New Roman" w:hAnsi="Times New Roman"/>
+          <w:smallCaps w:val="0"/>
+          <w:strike w:val="0"/>
+          <w:color w:val="000000"/>
+          <w:sz w:val="24"/>
+          <w:szCs w:val="24"/>
+          <w:shd w:fill="auto" w:val="clear"/>
+          <w:vertAlign w:val="baseline"/>
+        </w:rPr>
+      </w:pPr>
+      <w:r>
+        <w:rPr>
+          <w:rFonts w:ascii="Times New Roman" w:cs="Times New Roman" w:eastAsia="Times New Roman" w:hAnsi="Times New Roman"/>
+          <w:b w:val="0"/>
+          <w:bCs w:val="0"/>
+          <w:smallCaps w:val="0"/>
+          <w:strike w:val="0"/>
+          <w:color w:val="000000"/>
+          <w:sz w:val="24"/>
+          <w:szCs w:val="24"/>
+          <w:u w:val="none"/>
+          <w:shd w:fill="auto" w:val="clear"/>
+          <w:vertAlign w:val="baseline"/>
+          <w:rtl w:val="0"/>
+        </w:rPr>
+        <w:t xml:space="preserve">Krumm L, Terziev R, Kranz DD, </w:t>
+      </w:r>
+      <w:r>
+        <w:rPr>
+          <w:b w:val="1"/>
+          <w:bCs w:val="1"/>
+          <w:smallCaps w:val="0"/>
+          <w:strike w:val="0"/>
+          <w:color w:val="000000"/>
+          <w:sz w:val="24"/>
+          <w:szCs w:val="24"/>
+          <w:u w:val="none"/>
+          <w:shd w:fill="auto" w:val="clear"/>
+          <w:vertAlign w:val="baseline"/>
+          <w:rtl w:val="0"/>
+        </w:rPr>
+        <w:t xml:space="preserve">Westover MB</w:t>
+      </w:r>
+      <w:r>
+        <w:rPr>
+          <w:rFonts w:ascii="Times New Roman" w:cs="Times New Roman" w:eastAsia="Times New Roman" w:hAnsi="Times New Roman"/>
+          <w:b w:val="0"/>
+          <w:bCs w:val="0"/>
+          <w:smallCaps w:val="0"/>
+          <w:strike w:val="0"/>
+          <w:color w:val="000000"/>
+          <w:sz w:val="24"/>
+          <w:szCs w:val="24"/>
+          <w:u w:val="none"/>
+          <w:shd w:fill="auto" w:val="clear"/>
+          <w:vertAlign w:val="baseline"/>
+          <w:rtl w:val="0"/>
+        </w:rPr>
+        <w:t xml:space="preserve">, Meisel C. Between patterns and predictions: Interpretable latent EEG representations for clinical insights. Neuroimage Clin. 2026 Oct 14;52:104077. doi: 10.1016/j.nicl.2026.104077. Epub ahead of print. PMID: 42887172.</w:t>
       </w:r>
       <w:r>
         <w:rPr>

</xml_diff>